<commit_message>
Atualização das minutas de protocolo
</commit_message>
<xml_diff>
--- a/protocolos_minutas/AMA_Protocolo_CMD_Autenticação_Assinatura_Privados_.docx
+++ b/protocolos_minutas/AMA_Protocolo_CMD_Autenticação_Assinatura_Privados_.docx
@@ -1,6 +1,6 @@
 
 <file path=word/document.xml><?xml version="1.0" encoding="utf-8"?>
-<w:document xmlns:wpc="http://schemas.microsoft.com/office/word/2010/wordprocessingCanvas" xmlns:cx="http://schemas.microsoft.com/office/drawing/2014/chartex" xmlns:cx1="http://schemas.microsoft.com/office/drawing/2015/9/8/chartex" xmlns:cx2="http://schemas.microsoft.com/office/drawing/2015/10/21/chartex" xmlns:cx3="http://schemas.microsoft.com/office/drawing/2016/5/9/chartex" xmlns:cx4="http://schemas.microsoft.com/office/drawing/2016/5/10/chartex" xmlns:cx5="http://schemas.microsoft.com/office/drawing/2016/5/11/chartex" xmlns:cx6="http://schemas.microsoft.com/office/drawing/2016/5/12/chartex" xmlns:cx7="http://schemas.microsoft.com/office/drawing/2016/5/13/chartex" xmlns:cx8="http://schemas.microsoft.com/office/drawing/2016/5/14/chartex" xmlns:mc="http://schemas.openxmlformats.org/markup-compatibility/2006" xmlns:aink="http://schemas.microsoft.com/office/drawing/2016/ink" xmlns:am3d="http://schemas.microsoft.com/office/drawing/2017/model3d" xmlns:o="urn:schemas-microsoft-com:office:office" xmlns:oel="http://schemas.microsoft.com/office/2019/extlst" xmlns:r="http://schemas.openxmlformats.org/officeDocument/2006/relationships" xmlns:m="http://schemas.openxmlformats.org/officeDocument/2006/math" xmlns:v="urn:schemas-microsoft-com:vml" xmlns:wp14="http://schemas.microsoft.com/office/word/2010/wordprocessingDrawing" xmlns:wp="http://schemas.openxmlformats.org/drawingml/2006/wordprocessingDrawing" xmlns:w10="urn:schemas-microsoft-com:office:word" xmlns:w="http://schemas.openxmlformats.org/wordprocessingml/2006/main" xmlns:w14="http://schemas.microsoft.com/office/word/2010/wordml" xmlns:w15="http://schemas.microsoft.com/office/word/2012/wordml" xmlns:w16cex="http://schemas.microsoft.com/office/word/2018/wordml/cex" xmlns:w16cid="http://schemas.microsoft.com/office/word/2016/wordml/cid" xmlns:w16="http://schemas.microsoft.com/office/word/2018/wordml" xmlns:w16du="http://schemas.microsoft.com/office/word/2023/wordml/word16du" xmlns:w16sdtdh="http://schemas.microsoft.com/office/word/2020/wordml/sdtdatahash" xmlns:w16se="http://schemas.microsoft.com/office/word/2015/wordml/symex" xmlns:wpg="http://schemas.microsoft.com/office/word/2010/wordprocessingGroup" xmlns:wpi="http://schemas.microsoft.com/office/word/2010/wordprocessingInk" xmlns:wne="http://schemas.microsoft.com/office/word/2006/wordml" xmlns:wps="http://schemas.microsoft.com/office/word/2010/wordprocessingShape" mc:Ignorable="w14 w15 w16se w16cid w16 w16cex w16sdtdh w16du wp14">
+<w:document xmlns:wpc="http://schemas.microsoft.com/office/word/2010/wordprocessingCanvas" xmlns:cx="http://schemas.microsoft.com/office/drawing/2014/chartex" xmlns:cx1="http://schemas.microsoft.com/office/drawing/2015/9/8/chartex" xmlns:cx2="http://schemas.microsoft.com/office/drawing/2015/10/21/chartex" xmlns:cx3="http://schemas.microsoft.com/office/drawing/2016/5/9/chartex" xmlns:cx4="http://schemas.microsoft.com/office/drawing/2016/5/10/chartex" xmlns:cx5="http://schemas.microsoft.com/office/drawing/2016/5/11/chartex" xmlns:cx6="http://schemas.microsoft.com/office/drawing/2016/5/12/chartex" xmlns:cx7="http://schemas.microsoft.com/office/drawing/2016/5/13/chartex" xmlns:cx8="http://schemas.microsoft.com/office/drawing/2016/5/14/chartex" xmlns:mc="http://schemas.openxmlformats.org/markup-compatibility/2006" xmlns:aink="http://schemas.microsoft.com/office/drawing/2016/ink" xmlns:am3d="http://schemas.microsoft.com/office/drawing/2017/model3d" xmlns:o="urn:schemas-microsoft-com:office:office" xmlns:oel="http://schemas.microsoft.com/office/2019/extlst" xmlns:r="http://schemas.openxmlformats.org/officeDocument/2006/relationships" xmlns:m="http://schemas.openxmlformats.org/officeDocument/2006/math" xmlns:v="urn:schemas-microsoft-com:vml" xmlns:wp14="http://schemas.microsoft.com/office/word/2010/wordprocessingDrawing" xmlns:wp="http://schemas.openxmlformats.org/drawingml/2006/wordprocessingDrawing" xmlns:w10="urn:schemas-microsoft-com:office:word" xmlns:w="http://schemas.openxmlformats.org/wordprocessingml/2006/main" xmlns:w14="http://schemas.microsoft.com/office/word/2010/wordml" xmlns:w15="http://schemas.microsoft.com/office/word/2012/wordml" xmlns:w16cex="http://schemas.microsoft.com/office/word/2018/wordml/cex" xmlns:w16cid="http://schemas.microsoft.com/office/word/2016/wordml/cid" xmlns:w16="http://schemas.microsoft.com/office/word/2018/wordml" xmlns:w16du="http://schemas.microsoft.com/office/word/2023/wordml/word16du" xmlns:w16sdtdh="http://schemas.microsoft.com/office/word/2020/wordml/sdtdatahash" xmlns:w16sdtfl="http://schemas.microsoft.com/office/word/2024/wordml/sdtformatlock" xmlns:w16se="http://schemas.microsoft.com/office/word/2015/wordml/symex" xmlns:wpg="http://schemas.microsoft.com/office/word/2010/wordprocessingGroup" xmlns:wpi="http://schemas.microsoft.com/office/word/2010/wordprocessingInk" xmlns:wne="http://schemas.microsoft.com/office/word/2006/wordml" xmlns:wps="http://schemas.microsoft.com/office/word/2010/wordprocessingShape" mc:Ignorable="w14 w15 w16se w16cid w16 w16cex w16sdtdh w16sdtfl w16du wp14">
   <w:body>
     <w:p>
       <w:pPr>
@@ -140,12 +140,21 @@
         </w:rPr>
         <w:t xml:space="preserve">de ora em diante designada por </w:t>
       </w:r>
+      <w:proofErr w:type="gramStart"/>
       <w:r>
         <w:rPr>
           <w:rFonts w:asciiTheme="minorHAnsi" w:hAnsiTheme="minorHAnsi"/>
           <w:b/>
         </w:rPr>
-        <w:t xml:space="preserve">[….] </w:t>
+        <w:t>[….</w:t>
+      </w:r>
+      <w:proofErr w:type="gramEnd"/>
+      <w:r>
+        <w:rPr>
+          <w:rFonts w:asciiTheme="minorHAnsi" w:hAnsiTheme="minorHAnsi"/>
+          <w:b/>
+        </w:rPr>
+        <w:t xml:space="preserve">] </w:t>
       </w:r>
       <w:r>
         <w:rPr>
@@ -204,11 +213,19 @@
         </w:rPr>
         <w:t xml:space="preserve">, pessoa coletiva n.º </w:t>
       </w:r>
-      <w:r>
-        <w:rPr>
-          <w:rFonts w:asciiTheme="minorHAnsi" w:hAnsiTheme="minorHAnsi"/>
-        </w:rPr>
-        <w:t>[….]</w:t>
+      <w:proofErr w:type="gramStart"/>
+      <w:r>
+        <w:rPr>
+          <w:rFonts w:asciiTheme="minorHAnsi" w:hAnsiTheme="minorHAnsi"/>
+        </w:rPr>
+        <w:t>[….</w:t>
+      </w:r>
+      <w:proofErr w:type="gramEnd"/>
+      <w:r>
+        <w:rPr>
+          <w:rFonts w:asciiTheme="minorHAnsi" w:hAnsiTheme="minorHAnsi"/>
+        </w:rPr>
+        <w:t>]</w:t>
       </w:r>
       <w:r>
         <w:rPr>
@@ -220,7 +237,35 @@
         <w:rPr>
           <w:rFonts w:asciiTheme="minorHAnsi" w:hAnsiTheme="minorHAnsi"/>
         </w:rPr>
-        <w:t xml:space="preserve">por [….], na qualidade de [….], </w:t>
+        <w:t xml:space="preserve">por </w:t>
+      </w:r>
+      <w:proofErr w:type="gramStart"/>
+      <w:r>
+        <w:rPr>
+          <w:rFonts w:asciiTheme="minorHAnsi" w:hAnsiTheme="minorHAnsi"/>
+        </w:rPr>
+        <w:t>[….</w:t>
+      </w:r>
+      <w:proofErr w:type="gramEnd"/>
+      <w:r>
+        <w:rPr>
+          <w:rFonts w:asciiTheme="minorHAnsi" w:hAnsiTheme="minorHAnsi"/>
+        </w:rPr>
+        <w:t xml:space="preserve">], na qualidade de </w:t>
+      </w:r>
+      <w:proofErr w:type="gramStart"/>
+      <w:r>
+        <w:rPr>
+          <w:rFonts w:asciiTheme="minorHAnsi" w:hAnsiTheme="minorHAnsi"/>
+        </w:rPr>
+        <w:t>[….</w:t>
+      </w:r>
+      <w:proofErr w:type="gramEnd"/>
+      <w:r>
+        <w:rPr>
+          <w:rFonts w:asciiTheme="minorHAnsi" w:hAnsiTheme="minorHAnsi"/>
+        </w:rPr>
+        <w:t xml:space="preserve">], </w:t>
       </w:r>
       <w:r>
         <w:rPr>
@@ -544,7 +589,14 @@
         <w:rPr>
           <w:rFonts w:asciiTheme="minorHAnsi" w:hAnsiTheme="minorHAnsi"/>
         </w:rPr>
-        <w:t xml:space="preserve">Nos termos do n.º 11 do artigo 2.º da Lei n.º 37/2014, de 26 de junho, na sua redação atual, e do n.º 3 do artigo 11.º da Portaria n.º 77/2018, de 16 de março, </w:t>
+        <w:t xml:space="preserve">Nos termos do n.º 11 do artigo 2.º da Lei n.º 37/2014, de 26 de junho, na sua redação atual, e do n.º </w:t>
+      </w:r>
+      <w:r>
+        <w:rPr>
+          <w:rFonts w:asciiTheme="minorHAnsi" w:hAnsiTheme="minorHAnsi"/>
+        </w:rPr>
+        <w:lastRenderedPageBreak/>
+        <w:t xml:space="preserve">3 do artigo 11.º da Portaria n.º 77/2018, de 16 de março, </w:t>
       </w:r>
       <w:r>
         <w:rPr>
@@ -580,14 +632,7 @@
         <w:rPr>
           <w:rFonts w:asciiTheme="minorHAnsi" w:hAnsiTheme="minorHAnsi"/>
         </w:rPr>
-        <w:t xml:space="preserve"> de </w:t>
-      </w:r>
-      <w:r>
-        <w:rPr>
-          <w:rFonts w:asciiTheme="minorHAnsi" w:hAnsiTheme="minorHAnsi"/>
-        </w:rPr>
-        <w:lastRenderedPageBreak/>
-        <w:t>autenticação</w:t>
+        <w:t xml:space="preserve"> de autenticação</w:t>
       </w:r>
       <w:r>
         <w:rPr>
@@ -1054,6 +1099,7 @@
         <w:rPr>
           <w:rFonts w:asciiTheme="minorHAnsi" w:hAnsiTheme="minorHAnsi"/>
         </w:rPr>
+        <w:lastRenderedPageBreak/>
         <w:t xml:space="preserve">Disponibilizar </w:t>
       </w:r>
       <w:r>
@@ -1153,6 +1199,7 @@
         </w:rPr>
         <w:t xml:space="preserve">Garantir a administração, operação, </w:t>
       </w:r>
+      <w:proofErr w:type="spellStart"/>
       <w:r>
         <w:rPr>
           <w:rFonts w:asciiTheme="minorHAnsi" w:hAnsiTheme="minorHAnsi"/>
@@ -1160,6 +1207,7 @@
         </w:rPr>
         <w:t>help-desk</w:t>
       </w:r>
+      <w:proofErr w:type="spellEnd"/>
       <w:r>
         <w:rPr>
           <w:rFonts w:asciiTheme="minorHAnsi" w:hAnsiTheme="minorHAnsi"/>
@@ -1225,7 +1273,6 @@
         <w:rPr>
           <w:rFonts w:asciiTheme="minorHAnsi" w:hAnsiTheme="minorHAnsi"/>
         </w:rPr>
-        <w:lastRenderedPageBreak/>
         <w:t xml:space="preserve">Garantir o necessário acompanhamento técnico para a implementação do Fornecedor de Autenticação </w:t>
       </w:r>
       <w:r>
@@ -1821,7 +1868,14 @@
         <w:rPr>
           <w:rFonts w:asciiTheme="minorHAnsi" w:hAnsiTheme="minorHAnsi"/>
         </w:rPr>
-        <w:t xml:space="preserve"> relativamente às componentes sob a sua responsabilidade;</w:t>
+        <w:t xml:space="preserve"> relativamente às componentes sob a sua </w:t>
+      </w:r>
+      <w:r>
+        <w:rPr>
+          <w:rFonts w:asciiTheme="minorHAnsi" w:hAnsiTheme="minorHAnsi"/>
+        </w:rPr>
+        <w:lastRenderedPageBreak/>
+        <w:t>responsabilidade;</w:t>
       </w:r>
     </w:p>
     <w:p>
@@ -1948,7 +2002,6 @@
         <w:rPr>
           <w:rFonts w:asciiTheme="minorHAnsi" w:hAnsiTheme="minorHAnsi"/>
         </w:rPr>
-        <w:lastRenderedPageBreak/>
         <w:t>No âmbito da assinatura com Chave Móvel Digital, c</w:t>
       </w:r>
       <w:r>
@@ -1957,6 +2010,7 @@
         </w:rPr>
         <w:t xml:space="preserve">umprir as </w:t>
       </w:r>
+      <w:proofErr w:type="spellStart"/>
       <w:r>
         <w:rPr>
           <w:rFonts w:asciiTheme="minorHAnsi" w:hAnsiTheme="minorHAnsi"/>
@@ -1964,6 +2018,7 @@
         </w:rPr>
         <w:t>guidelines</w:t>
       </w:r>
+      <w:proofErr w:type="spellEnd"/>
       <w:r>
         <w:rPr>
           <w:rFonts w:asciiTheme="minorHAnsi" w:hAnsiTheme="minorHAnsi"/>
@@ -2019,12 +2074,21 @@
         </w:rPr>
         <w:t xml:space="preserve"> para cada uma das </w:t>
       </w:r>
+      <w:proofErr w:type="spellStart"/>
       <w:r>
         <w:rPr>
           <w:rFonts w:asciiTheme="minorHAnsi" w:hAnsiTheme="minorHAnsi"/>
           <w:i/>
         </w:rPr>
-        <w:t xml:space="preserve">guidelines </w:t>
+        <w:t>guidelines</w:t>
+      </w:r>
+      <w:proofErr w:type="spellEnd"/>
+      <w:r>
+        <w:rPr>
+          <w:rFonts w:asciiTheme="minorHAnsi" w:hAnsiTheme="minorHAnsi"/>
+          <w:i/>
+        </w:rPr>
+        <w:t xml:space="preserve"> </w:t>
       </w:r>
       <w:r>
         <w:rPr>
@@ -2511,6 +2575,7 @@
         <w:rPr>
           <w:rFonts w:asciiTheme="minorHAnsi" w:hAnsiTheme="minorHAnsi"/>
         </w:rPr>
+        <w:lastRenderedPageBreak/>
         <w:t xml:space="preserve">3 – </w:t>
       </w:r>
       <w:r>
@@ -2684,7 +2749,6 @@
         <w:rPr>
           <w:rFonts w:asciiTheme="minorHAnsi" w:hAnsiTheme="minorHAnsi" w:cstheme="minorBidi"/>
         </w:rPr>
-        <w:lastRenderedPageBreak/>
         <w:t xml:space="preserve">As comunicações a que haja lugar entre as Partes Outorgantes serão efetuadas por correio eletrónico para os endereços dos gestores do presente </w:t>
       </w:r>
       <w:r>
@@ -3048,6 +3112,7 @@
         <w:rPr>
           <w:rFonts w:asciiTheme="minorHAnsi" w:hAnsiTheme="minorHAnsi" w:cstheme="minorBidi"/>
         </w:rPr>
+        <w:lastRenderedPageBreak/>
         <w:t>Para os efeitos legais e os que decorrerem da execução do presente Protocolo, são identificados pelas Partes os respetivos encarregados de proteção de dados, responsáveis, nomeadamente:</w:t>
       </w:r>
     </w:p>
@@ -3155,14 +3220,7 @@
         <w:rPr>
           <w:rFonts w:asciiTheme="minorHAnsi" w:hAnsiTheme="minorHAnsi" w:cstheme="minorBidi"/>
         </w:rPr>
-        <w:t xml:space="preserve">Os Outorgantes obrigam-se a garantir o sigilo quanto à informação e elementos de que o seu pessoal ou subcontratados venham a ter conhecimento em virtude do presente Protocolo, devendo ser tratada como estritamente confidencial toda a informação escrita, verbal ou constante de suporte informático </w:t>
-      </w:r>
-      <w:r>
-        <w:rPr>
-          <w:rFonts w:asciiTheme="minorHAnsi" w:hAnsiTheme="minorHAnsi" w:cstheme="minorBidi"/>
-        </w:rPr>
-        <w:lastRenderedPageBreak/>
-        <w:t xml:space="preserve">que contenha dados de natureza organizativa, técnica, comercial ou financeira, listas de clientes, de fornecedores, de equipamentos ou de produtos ou qualquer outra informação relativa aos serviços e à atividade da AMA e do </w:t>
+        <w:t xml:space="preserve">Os Outorgantes obrigam-se a garantir o sigilo quanto à informação e elementos de que o seu pessoal ou subcontratados venham a ter conhecimento em virtude do presente Protocolo, devendo ser tratada como estritamente confidencial toda a informação escrita, verbal ou constante de suporte informático que contenha dados de natureza organizativa, técnica, comercial ou financeira, listas de clientes, de fornecedores, de equipamentos ou de produtos ou qualquer outra informação relativa aos serviços e à atividade da AMA e do </w:t>
       </w:r>
       <w:r>
         <w:rPr>
@@ -3502,6 +3560,7 @@
         <w:rPr>
           <w:rFonts w:asciiTheme="minorHAnsi" w:hAnsiTheme="minorHAnsi"/>
         </w:rPr>
+        <w:lastRenderedPageBreak/>
         <w:t xml:space="preserve">3 - A AMA pode suspender ou cessar </w:t>
       </w:r>
       <w:r>
@@ -4260,9 +4319,12 @@
       </w:pPr>
     </w:p>
     <w:sectPr>
-      <w:headerReference w:type="default" r:id="rId15"/>
-      <w:footerReference w:type="default" r:id="rId16"/>
-      <w:headerReference w:type="first" r:id="rId17"/>
+      <w:headerReference w:type="even" r:id="rId15"/>
+      <w:headerReference w:type="default" r:id="rId16"/>
+      <w:footerReference w:type="even" r:id="rId17"/>
+      <w:footerReference w:type="default" r:id="rId18"/>
+      <w:headerReference w:type="first" r:id="rId19"/>
+      <w:footerReference w:type="first" r:id="rId20"/>
       <w:pgSz w:w="11906" w:h="16838"/>
       <w:pgMar w:top="1417" w:right="1133" w:bottom="1417" w:left="1418" w:header="708" w:footer="708" w:gutter="0"/>
       <w:cols w:space="708"/>
@@ -4273,7 +4335,7 @@
 </file>
 
 <file path=word/endnotes.xml><?xml version="1.0" encoding="utf-8"?>
-<w:endnotes xmlns:wpc="http://schemas.microsoft.com/office/word/2010/wordprocessingCanvas" xmlns:cx="http://schemas.microsoft.com/office/drawing/2014/chartex" xmlns:cx1="http://schemas.microsoft.com/office/drawing/2015/9/8/chartex" xmlns:cx2="http://schemas.microsoft.com/office/drawing/2015/10/21/chartex" xmlns:cx3="http://schemas.microsoft.com/office/drawing/2016/5/9/chartex" xmlns:cx4="http://schemas.microsoft.com/office/drawing/2016/5/10/chartex" xmlns:cx5="http://schemas.microsoft.com/office/drawing/2016/5/11/chartex" xmlns:cx6="http://schemas.microsoft.com/office/drawing/2016/5/12/chartex" xmlns:cx7="http://schemas.microsoft.com/office/drawing/2016/5/13/chartex" xmlns:cx8="http://schemas.microsoft.com/office/drawing/2016/5/14/chartex" xmlns:mc="http://schemas.openxmlformats.org/markup-compatibility/2006" xmlns:aink="http://schemas.microsoft.com/office/drawing/2016/ink" xmlns:am3d="http://schemas.microsoft.com/office/drawing/2017/model3d" xmlns:o="urn:schemas-microsoft-com:office:office" xmlns:oel="http://schemas.microsoft.com/office/2019/extlst" xmlns:r="http://schemas.openxmlformats.org/officeDocument/2006/relationships" xmlns:m="http://schemas.openxmlformats.org/officeDocument/2006/math" xmlns:v="urn:schemas-microsoft-com:vml" xmlns:wp14="http://schemas.microsoft.com/office/word/2010/wordprocessingDrawing" xmlns:wp="http://schemas.openxmlformats.org/drawingml/2006/wordprocessingDrawing" xmlns:w10="urn:schemas-microsoft-com:office:word" xmlns:w="http://schemas.openxmlformats.org/wordprocessingml/2006/main" xmlns:w14="http://schemas.microsoft.com/office/word/2010/wordml" xmlns:w15="http://schemas.microsoft.com/office/word/2012/wordml" xmlns:w16cex="http://schemas.microsoft.com/office/word/2018/wordml/cex" xmlns:w16cid="http://schemas.microsoft.com/office/word/2016/wordml/cid" xmlns:w16="http://schemas.microsoft.com/office/word/2018/wordml" xmlns:w16du="http://schemas.microsoft.com/office/word/2023/wordml/word16du" xmlns:w16sdtdh="http://schemas.microsoft.com/office/word/2020/wordml/sdtdatahash" xmlns:w16se="http://schemas.microsoft.com/office/word/2015/wordml/symex" xmlns:wpg="http://schemas.microsoft.com/office/word/2010/wordprocessingGroup" xmlns:wpi="http://schemas.microsoft.com/office/word/2010/wordprocessingInk" xmlns:wne="http://schemas.microsoft.com/office/word/2006/wordml" xmlns:wps="http://schemas.microsoft.com/office/word/2010/wordprocessingShape" mc:Ignorable="w14 w15 w16se w16cid w16 w16cex w16sdtdh w16du wp14">
+<w:endnotes xmlns:wpc="http://schemas.microsoft.com/office/word/2010/wordprocessingCanvas" xmlns:cx="http://schemas.microsoft.com/office/drawing/2014/chartex" xmlns:cx1="http://schemas.microsoft.com/office/drawing/2015/9/8/chartex" xmlns:cx2="http://schemas.microsoft.com/office/drawing/2015/10/21/chartex" xmlns:cx3="http://schemas.microsoft.com/office/drawing/2016/5/9/chartex" xmlns:cx4="http://schemas.microsoft.com/office/drawing/2016/5/10/chartex" xmlns:cx5="http://schemas.microsoft.com/office/drawing/2016/5/11/chartex" xmlns:cx6="http://schemas.microsoft.com/office/drawing/2016/5/12/chartex" xmlns:cx7="http://schemas.microsoft.com/office/drawing/2016/5/13/chartex" xmlns:cx8="http://schemas.microsoft.com/office/drawing/2016/5/14/chartex" xmlns:mc="http://schemas.openxmlformats.org/markup-compatibility/2006" xmlns:aink="http://schemas.microsoft.com/office/drawing/2016/ink" xmlns:am3d="http://schemas.microsoft.com/office/drawing/2017/model3d" xmlns:o="urn:schemas-microsoft-com:office:office" xmlns:oel="http://schemas.microsoft.com/office/2019/extlst" xmlns:r="http://schemas.openxmlformats.org/officeDocument/2006/relationships" xmlns:m="http://schemas.openxmlformats.org/officeDocument/2006/math" xmlns:v="urn:schemas-microsoft-com:vml" xmlns:wp14="http://schemas.microsoft.com/office/word/2010/wordprocessingDrawing" xmlns:wp="http://schemas.openxmlformats.org/drawingml/2006/wordprocessingDrawing" xmlns:w10="urn:schemas-microsoft-com:office:word" xmlns:w="http://schemas.openxmlformats.org/wordprocessingml/2006/main" xmlns:w14="http://schemas.microsoft.com/office/word/2010/wordml" xmlns:w15="http://schemas.microsoft.com/office/word/2012/wordml" xmlns:w16cex="http://schemas.microsoft.com/office/word/2018/wordml/cex" xmlns:w16cid="http://schemas.microsoft.com/office/word/2016/wordml/cid" xmlns:w16="http://schemas.microsoft.com/office/word/2018/wordml" xmlns:w16du="http://schemas.microsoft.com/office/word/2023/wordml/word16du" xmlns:w16sdtdh="http://schemas.microsoft.com/office/word/2020/wordml/sdtdatahash" xmlns:w16sdtfl="http://schemas.microsoft.com/office/word/2024/wordml/sdtformatlock" xmlns:w16se="http://schemas.microsoft.com/office/word/2015/wordml/symex" xmlns:wpg="http://schemas.microsoft.com/office/word/2010/wordprocessingGroup" xmlns:wpi="http://schemas.microsoft.com/office/word/2010/wordprocessingInk" xmlns:wne="http://schemas.microsoft.com/office/word/2006/wordml" xmlns:wps="http://schemas.microsoft.com/office/word/2010/wordprocessingShape" mc:Ignorable="w14 w15 w16se w16cid w16 w16cex w16sdtdh w16sdtfl w16du wp14">
   <w:endnote w:type="separator" w:id="-1">
     <w:p>
       <w:r>
@@ -4292,7 +4354,17 @@
 </file>
 
 <file path=word/footer1.xml><?xml version="1.0" encoding="utf-8"?>
-<w:ftr xmlns:wpc="http://schemas.microsoft.com/office/word/2010/wordprocessingCanvas" xmlns:cx="http://schemas.microsoft.com/office/drawing/2014/chartex" xmlns:cx1="http://schemas.microsoft.com/office/drawing/2015/9/8/chartex" xmlns:cx2="http://schemas.microsoft.com/office/drawing/2015/10/21/chartex" xmlns:cx3="http://schemas.microsoft.com/office/drawing/2016/5/9/chartex" xmlns:cx4="http://schemas.microsoft.com/office/drawing/2016/5/10/chartex" xmlns:cx5="http://schemas.microsoft.com/office/drawing/2016/5/11/chartex" xmlns:cx6="http://schemas.microsoft.com/office/drawing/2016/5/12/chartex" xmlns:cx7="http://schemas.microsoft.com/office/drawing/2016/5/13/chartex" xmlns:cx8="http://schemas.microsoft.com/office/drawing/2016/5/14/chartex" xmlns:mc="http://schemas.openxmlformats.org/markup-compatibility/2006" xmlns:aink="http://schemas.microsoft.com/office/drawing/2016/ink" xmlns:am3d="http://schemas.microsoft.com/office/drawing/2017/model3d" xmlns:o="urn:schemas-microsoft-com:office:office" xmlns:oel="http://schemas.microsoft.com/office/2019/extlst" xmlns:r="http://schemas.openxmlformats.org/officeDocument/2006/relationships" xmlns:m="http://schemas.openxmlformats.org/officeDocument/2006/math" xmlns:v="urn:schemas-microsoft-com:vml" xmlns:wp14="http://schemas.microsoft.com/office/word/2010/wordprocessingDrawing" xmlns:wp="http://schemas.openxmlformats.org/drawingml/2006/wordprocessingDrawing" xmlns:w10="urn:schemas-microsoft-com:office:word" xmlns:w="http://schemas.openxmlformats.org/wordprocessingml/2006/main" xmlns:w14="http://schemas.microsoft.com/office/word/2010/wordml" xmlns:w15="http://schemas.microsoft.com/office/word/2012/wordml" xmlns:w16cex="http://schemas.microsoft.com/office/word/2018/wordml/cex" xmlns:w16cid="http://schemas.microsoft.com/office/word/2016/wordml/cid" xmlns:w16="http://schemas.microsoft.com/office/word/2018/wordml" xmlns:w16du="http://schemas.microsoft.com/office/word/2023/wordml/word16du" xmlns:w16sdtdh="http://schemas.microsoft.com/office/word/2020/wordml/sdtdatahash" xmlns:w16se="http://schemas.microsoft.com/office/word/2015/wordml/symex" xmlns:wpg="http://schemas.microsoft.com/office/word/2010/wordprocessingGroup" xmlns:wpi="http://schemas.microsoft.com/office/word/2010/wordprocessingInk" xmlns:wne="http://schemas.microsoft.com/office/word/2006/wordml" xmlns:wps="http://schemas.microsoft.com/office/word/2010/wordprocessingShape" mc:Ignorable="w14 w15 w16se w16cid w16 w16cex w16sdtdh w16du wp14">
+<w:ftr xmlns:wpc="http://schemas.microsoft.com/office/word/2010/wordprocessingCanvas" xmlns:cx="http://schemas.microsoft.com/office/drawing/2014/chartex" xmlns:cx1="http://schemas.microsoft.com/office/drawing/2015/9/8/chartex" xmlns:cx2="http://schemas.microsoft.com/office/drawing/2015/10/21/chartex" xmlns:cx3="http://schemas.microsoft.com/office/drawing/2016/5/9/chartex" xmlns:cx4="http://schemas.microsoft.com/office/drawing/2016/5/10/chartex" xmlns:cx5="http://schemas.microsoft.com/office/drawing/2016/5/11/chartex" xmlns:cx6="http://schemas.microsoft.com/office/drawing/2016/5/12/chartex" xmlns:cx7="http://schemas.microsoft.com/office/drawing/2016/5/13/chartex" xmlns:cx8="http://schemas.microsoft.com/office/drawing/2016/5/14/chartex" xmlns:mc="http://schemas.openxmlformats.org/markup-compatibility/2006" xmlns:aink="http://schemas.microsoft.com/office/drawing/2016/ink" xmlns:am3d="http://schemas.microsoft.com/office/drawing/2017/model3d" xmlns:o="urn:schemas-microsoft-com:office:office" xmlns:oel="http://schemas.microsoft.com/office/2019/extlst" xmlns:r="http://schemas.openxmlformats.org/officeDocument/2006/relationships" xmlns:m="http://schemas.openxmlformats.org/officeDocument/2006/math" xmlns:v="urn:schemas-microsoft-com:vml" xmlns:wp14="http://schemas.microsoft.com/office/word/2010/wordprocessingDrawing" xmlns:wp="http://schemas.openxmlformats.org/drawingml/2006/wordprocessingDrawing" xmlns:w10="urn:schemas-microsoft-com:office:word" xmlns:w="http://schemas.openxmlformats.org/wordprocessingml/2006/main" xmlns:w14="http://schemas.microsoft.com/office/word/2010/wordml" xmlns:w15="http://schemas.microsoft.com/office/word/2012/wordml" xmlns:w16cex="http://schemas.microsoft.com/office/word/2018/wordml/cex" xmlns:w16cid="http://schemas.microsoft.com/office/word/2016/wordml/cid" xmlns:w16="http://schemas.microsoft.com/office/word/2018/wordml" xmlns:w16du="http://schemas.microsoft.com/office/word/2023/wordml/word16du" xmlns:w16sdtdh="http://schemas.microsoft.com/office/word/2020/wordml/sdtdatahash" xmlns:w16sdtfl="http://schemas.microsoft.com/office/word/2024/wordml/sdtformatlock" xmlns:w16se="http://schemas.microsoft.com/office/word/2015/wordml/symex" xmlns:wpg="http://schemas.microsoft.com/office/word/2010/wordprocessingGroup" xmlns:wpi="http://schemas.microsoft.com/office/word/2010/wordprocessingInk" xmlns:wne="http://schemas.microsoft.com/office/word/2006/wordml" xmlns:wps="http://schemas.microsoft.com/office/word/2010/wordprocessingShape" mc:Ignorable="w14 w15 w16se w16cid w16 w16cex w16sdtdh w16sdtfl w16du wp14">
+  <w:p>
+    <w:pPr>
+      <w:pStyle w:val="Footer"/>
+    </w:pPr>
+  </w:p>
+</w:ftr>
+</file>
+
+<file path=word/footer2.xml><?xml version="1.0" encoding="utf-8"?>
+<w:ftr xmlns:wpc="http://schemas.microsoft.com/office/word/2010/wordprocessingCanvas" xmlns:cx="http://schemas.microsoft.com/office/drawing/2014/chartex" xmlns:cx1="http://schemas.microsoft.com/office/drawing/2015/9/8/chartex" xmlns:cx2="http://schemas.microsoft.com/office/drawing/2015/10/21/chartex" xmlns:cx3="http://schemas.microsoft.com/office/drawing/2016/5/9/chartex" xmlns:cx4="http://schemas.microsoft.com/office/drawing/2016/5/10/chartex" xmlns:cx5="http://schemas.microsoft.com/office/drawing/2016/5/11/chartex" xmlns:cx6="http://schemas.microsoft.com/office/drawing/2016/5/12/chartex" xmlns:cx7="http://schemas.microsoft.com/office/drawing/2016/5/13/chartex" xmlns:cx8="http://schemas.microsoft.com/office/drawing/2016/5/14/chartex" xmlns:mc="http://schemas.openxmlformats.org/markup-compatibility/2006" xmlns:aink="http://schemas.microsoft.com/office/drawing/2016/ink" xmlns:am3d="http://schemas.microsoft.com/office/drawing/2017/model3d" xmlns:o="urn:schemas-microsoft-com:office:office" xmlns:oel="http://schemas.microsoft.com/office/2019/extlst" xmlns:r="http://schemas.openxmlformats.org/officeDocument/2006/relationships" xmlns:m="http://schemas.openxmlformats.org/officeDocument/2006/math" xmlns:v="urn:schemas-microsoft-com:vml" xmlns:wp14="http://schemas.microsoft.com/office/word/2010/wordprocessingDrawing" xmlns:wp="http://schemas.openxmlformats.org/drawingml/2006/wordprocessingDrawing" xmlns:w10="urn:schemas-microsoft-com:office:word" xmlns:w="http://schemas.openxmlformats.org/wordprocessingml/2006/main" xmlns:w14="http://schemas.microsoft.com/office/word/2010/wordml" xmlns:w15="http://schemas.microsoft.com/office/word/2012/wordml" xmlns:w16cex="http://schemas.microsoft.com/office/word/2018/wordml/cex" xmlns:w16cid="http://schemas.microsoft.com/office/word/2016/wordml/cid" xmlns:w16="http://schemas.microsoft.com/office/word/2018/wordml" xmlns:w16du="http://schemas.microsoft.com/office/word/2023/wordml/word16du" xmlns:w16sdtdh="http://schemas.microsoft.com/office/word/2020/wordml/sdtdatahash" xmlns:w16sdtfl="http://schemas.microsoft.com/office/word/2024/wordml/sdtformatlock" xmlns:w16se="http://schemas.microsoft.com/office/word/2015/wordml/symex" xmlns:wpg="http://schemas.microsoft.com/office/word/2010/wordprocessingGroup" xmlns:wpi="http://schemas.microsoft.com/office/word/2010/wordprocessingInk" xmlns:wne="http://schemas.microsoft.com/office/word/2006/wordml" xmlns:wps="http://schemas.microsoft.com/office/word/2010/wordprocessingShape" mc:Ignorable="w14 w15 w16se w16cid w16 w16cex w16sdtdh w16sdtfl w16du wp14">
   <w:p>
     <w:pPr>
       <w:rPr>
@@ -5060,8 +5132,18 @@
 </w:ftr>
 </file>
 
+<file path=word/footer3.xml><?xml version="1.0" encoding="utf-8"?>
+<w:ftr xmlns:wpc="http://schemas.microsoft.com/office/word/2010/wordprocessingCanvas" xmlns:cx="http://schemas.microsoft.com/office/drawing/2014/chartex" xmlns:cx1="http://schemas.microsoft.com/office/drawing/2015/9/8/chartex" xmlns:cx2="http://schemas.microsoft.com/office/drawing/2015/10/21/chartex" xmlns:cx3="http://schemas.microsoft.com/office/drawing/2016/5/9/chartex" xmlns:cx4="http://schemas.microsoft.com/office/drawing/2016/5/10/chartex" xmlns:cx5="http://schemas.microsoft.com/office/drawing/2016/5/11/chartex" xmlns:cx6="http://schemas.microsoft.com/office/drawing/2016/5/12/chartex" xmlns:cx7="http://schemas.microsoft.com/office/drawing/2016/5/13/chartex" xmlns:cx8="http://schemas.microsoft.com/office/drawing/2016/5/14/chartex" xmlns:mc="http://schemas.openxmlformats.org/markup-compatibility/2006" xmlns:aink="http://schemas.microsoft.com/office/drawing/2016/ink" xmlns:am3d="http://schemas.microsoft.com/office/drawing/2017/model3d" xmlns:o="urn:schemas-microsoft-com:office:office" xmlns:oel="http://schemas.microsoft.com/office/2019/extlst" xmlns:r="http://schemas.openxmlformats.org/officeDocument/2006/relationships" xmlns:m="http://schemas.openxmlformats.org/officeDocument/2006/math" xmlns:v="urn:schemas-microsoft-com:vml" xmlns:wp14="http://schemas.microsoft.com/office/word/2010/wordprocessingDrawing" xmlns:wp="http://schemas.openxmlformats.org/drawingml/2006/wordprocessingDrawing" xmlns:w10="urn:schemas-microsoft-com:office:word" xmlns:w="http://schemas.openxmlformats.org/wordprocessingml/2006/main" xmlns:w14="http://schemas.microsoft.com/office/word/2010/wordml" xmlns:w15="http://schemas.microsoft.com/office/word/2012/wordml" xmlns:w16cex="http://schemas.microsoft.com/office/word/2018/wordml/cex" xmlns:w16cid="http://schemas.microsoft.com/office/word/2016/wordml/cid" xmlns:w16="http://schemas.microsoft.com/office/word/2018/wordml" xmlns:w16du="http://schemas.microsoft.com/office/word/2023/wordml/word16du" xmlns:w16sdtdh="http://schemas.microsoft.com/office/word/2020/wordml/sdtdatahash" xmlns:w16sdtfl="http://schemas.microsoft.com/office/word/2024/wordml/sdtformatlock" xmlns:w16se="http://schemas.microsoft.com/office/word/2015/wordml/symex" xmlns:wpg="http://schemas.microsoft.com/office/word/2010/wordprocessingGroup" xmlns:wpi="http://schemas.microsoft.com/office/word/2010/wordprocessingInk" xmlns:wne="http://schemas.microsoft.com/office/word/2006/wordml" xmlns:wps="http://schemas.microsoft.com/office/word/2010/wordprocessingShape" mc:Ignorable="w14 w15 w16se w16cid w16 w16cex w16sdtdh w16sdtfl w16du wp14">
+  <w:p>
+    <w:pPr>
+      <w:pStyle w:val="Footer"/>
+    </w:pPr>
+  </w:p>
+</w:ftr>
+</file>
+
 <file path=word/footnotes.xml><?xml version="1.0" encoding="utf-8"?>
-<w:footnotes xmlns:wpc="http://schemas.microsoft.com/office/word/2010/wordprocessingCanvas" xmlns:cx="http://schemas.microsoft.com/office/drawing/2014/chartex" xmlns:cx1="http://schemas.microsoft.com/office/drawing/2015/9/8/chartex" xmlns:cx2="http://schemas.microsoft.com/office/drawing/2015/10/21/chartex" xmlns:cx3="http://schemas.microsoft.com/office/drawing/2016/5/9/chartex" xmlns:cx4="http://schemas.microsoft.com/office/drawing/2016/5/10/chartex" xmlns:cx5="http://schemas.microsoft.com/office/drawing/2016/5/11/chartex" xmlns:cx6="http://schemas.microsoft.com/office/drawing/2016/5/12/chartex" xmlns:cx7="http://schemas.microsoft.com/office/drawing/2016/5/13/chartex" xmlns:cx8="http://schemas.microsoft.com/office/drawing/2016/5/14/chartex" xmlns:mc="http://schemas.openxmlformats.org/markup-compatibility/2006" xmlns:aink="http://schemas.microsoft.com/office/drawing/2016/ink" xmlns:am3d="http://schemas.microsoft.com/office/drawing/2017/model3d" xmlns:o="urn:schemas-microsoft-com:office:office" xmlns:oel="http://schemas.microsoft.com/office/2019/extlst" xmlns:r="http://schemas.openxmlformats.org/officeDocument/2006/relationships" xmlns:m="http://schemas.openxmlformats.org/officeDocument/2006/math" xmlns:v="urn:schemas-microsoft-com:vml" xmlns:wp14="http://schemas.microsoft.com/office/word/2010/wordprocessingDrawing" xmlns:wp="http://schemas.openxmlformats.org/drawingml/2006/wordprocessingDrawing" xmlns:w10="urn:schemas-microsoft-com:office:word" xmlns:w="http://schemas.openxmlformats.org/wordprocessingml/2006/main" xmlns:w14="http://schemas.microsoft.com/office/word/2010/wordml" xmlns:w15="http://schemas.microsoft.com/office/word/2012/wordml" xmlns:w16cex="http://schemas.microsoft.com/office/word/2018/wordml/cex" xmlns:w16cid="http://schemas.microsoft.com/office/word/2016/wordml/cid" xmlns:w16="http://schemas.microsoft.com/office/word/2018/wordml" xmlns:w16du="http://schemas.microsoft.com/office/word/2023/wordml/word16du" xmlns:w16sdtdh="http://schemas.microsoft.com/office/word/2020/wordml/sdtdatahash" xmlns:w16se="http://schemas.microsoft.com/office/word/2015/wordml/symex" xmlns:wpg="http://schemas.microsoft.com/office/word/2010/wordprocessingGroup" xmlns:wpi="http://schemas.microsoft.com/office/word/2010/wordprocessingInk" xmlns:wne="http://schemas.microsoft.com/office/word/2006/wordml" xmlns:wps="http://schemas.microsoft.com/office/word/2010/wordprocessingShape" mc:Ignorable="w14 w15 w16se w16cid w16 w16cex w16sdtdh w16du wp14">
+<w:footnotes xmlns:wpc="http://schemas.microsoft.com/office/word/2010/wordprocessingCanvas" xmlns:cx="http://schemas.microsoft.com/office/drawing/2014/chartex" xmlns:cx1="http://schemas.microsoft.com/office/drawing/2015/9/8/chartex" xmlns:cx2="http://schemas.microsoft.com/office/drawing/2015/10/21/chartex" xmlns:cx3="http://schemas.microsoft.com/office/drawing/2016/5/9/chartex" xmlns:cx4="http://schemas.microsoft.com/office/drawing/2016/5/10/chartex" xmlns:cx5="http://schemas.microsoft.com/office/drawing/2016/5/11/chartex" xmlns:cx6="http://schemas.microsoft.com/office/drawing/2016/5/12/chartex" xmlns:cx7="http://schemas.microsoft.com/office/drawing/2016/5/13/chartex" xmlns:cx8="http://schemas.microsoft.com/office/drawing/2016/5/14/chartex" xmlns:mc="http://schemas.openxmlformats.org/markup-compatibility/2006" xmlns:aink="http://schemas.microsoft.com/office/drawing/2016/ink" xmlns:am3d="http://schemas.microsoft.com/office/drawing/2017/model3d" xmlns:o="urn:schemas-microsoft-com:office:office" xmlns:oel="http://schemas.microsoft.com/office/2019/extlst" xmlns:r="http://schemas.openxmlformats.org/officeDocument/2006/relationships" xmlns:m="http://schemas.openxmlformats.org/officeDocument/2006/math" xmlns:v="urn:schemas-microsoft-com:vml" xmlns:wp14="http://schemas.microsoft.com/office/word/2010/wordprocessingDrawing" xmlns:wp="http://schemas.openxmlformats.org/drawingml/2006/wordprocessingDrawing" xmlns:w10="urn:schemas-microsoft-com:office:word" xmlns:w="http://schemas.openxmlformats.org/wordprocessingml/2006/main" xmlns:w14="http://schemas.microsoft.com/office/word/2010/wordml" xmlns:w15="http://schemas.microsoft.com/office/word/2012/wordml" xmlns:w16cex="http://schemas.microsoft.com/office/word/2018/wordml/cex" xmlns:w16cid="http://schemas.microsoft.com/office/word/2016/wordml/cid" xmlns:w16="http://schemas.microsoft.com/office/word/2018/wordml" xmlns:w16du="http://schemas.microsoft.com/office/word/2023/wordml/word16du" xmlns:w16sdtdh="http://schemas.microsoft.com/office/word/2020/wordml/sdtdatahash" xmlns:w16sdtfl="http://schemas.microsoft.com/office/word/2024/wordml/sdtformatlock" xmlns:w16se="http://schemas.microsoft.com/office/word/2015/wordml/symex" xmlns:wpg="http://schemas.microsoft.com/office/word/2010/wordprocessingGroup" xmlns:wpi="http://schemas.microsoft.com/office/word/2010/wordprocessingInk" xmlns:wne="http://schemas.microsoft.com/office/word/2006/wordml" xmlns:wps="http://schemas.microsoft.com/office/word/2010/wordprocessingShape" mc:Ignorable="w14 w15 w16se w16cid w16 w16cex w16sdtdh w16sdtfl w16du wp14">
   <w:footnote w:type="separator" w:id="-1">
     <w:p>
       <w:r>
@@ -5080,7 +5162,17 @@
 </file>
 
 <file path=word/header1.xml><?xml version="1.0" encoding="utf-8"?>
-<w:hdr xmlns:wpc="http://schemas.microsoft.com/office/word/2010/wordprocessingCanvas" xmlns:cx="http://schemas.microsoft.com/office/drawing/2014/chartex" xmlns:cx1="http://schemas.microsoft.com/office/drawing/2015/9/8/chartex" xmlns:cx2="http://schemas.microsoft.com/office/drawing/2015/10/21/chartex" xmlns:cx3="http://schemas.microsoft.com/office/drawing/2016/5/9/chartex" xmlns:cx4="http://schemas.microsoft.com/office/drawing/2016/5/10/chartex" xmlns:cx5="http://schemas.microsoft.com/office/drawing/2016/5/11/chartex" xmlns:cx6="http://schemas.microsoft.com/office/drawing/2016/5/12/chartex" xmlns:cx7="http://schemas.microsoft.com/office/drawing/2016/5/13/chartex" xmlns:cx8="http://schemas.microsoft.com/office/drawing/2016/5/14/chartex" xmlns:mc="http://schemas.openxmlformats.org/markup-compatibility/2006" xmlns:aink="http://schemas.microsoft.com/office/drawing/2016/ink" xmlns:am3d="http://schemas.microsoft.com/office/drawing/2017/model3d" xmlns:o="urn:schemas-microsoft-com:office:office" xmlns:oel="http://schemas.microsoft.com/office/2019/extlst" xmlns:r="http://schemas.openxmlformats.org/officeDocument/2006/relationships" xmlns:m="http://schemas.openxmlformats.org/officeDocument/2006/math" xmlns:v="urn:schemas-microsoft-com:vml" xmlns:wp14="http://schemas.microsoft.com/office/word/2010/wordprocessingDrawing" xmlns:wp="http://schemas.openxmlformats.org/drawingml/2006/wordprocessingDrawing" xmlns:w10="urn:schemas-microsoft-com:office:word" xmlns:w="http://schemas.openxmlformats.org/wordprocessingml/2006/main" xmlns:w14="http://schemas.microsoft.com/office/word/2010/wordml" xmlns:w15="http://schemas.microsoft.com/office/word/2012/wordml" xmlns:w16cex="http://schemas.microsoft.com/office/word/2018/wordml/cex" xmlns:w16cid="http://schemas.microsoft.com/office/word/2016/wordml/cid" xmlns:w16="http://schemas.microsoft.com/office/word/2018/wordml" xmlns:w16du="http://schemas.microsoft.com/office/word/2023/wordml/word16du" xmlns:w16sdtdh="http://schemas.microsoft.com/office/word/2020/wordml/sdtdatahash" xmlns:w16se="http://schemas.microsoft.com/office/word/2015/wordml/symex" xmlns:wpg="http://schemas.microsoft.com/office/word/2010/wordprocessingGroup" xmlns:wpi="http://schemas.microsoft.com/office/word/2010/wordprocessingInk" xmlns:wne="http://schemas.microsoft.com/office/word/2006/wordml" xmlns:wps="http://schemas.microsoft.com/office/word/2010/wordprocessingShape" mc:Ignorable="w14 w15 w16se w16cid w16 w16cex w16sdtdh w16du wp14">
+<w:hdr xmlns:wpc="http://schemas.microsoft.com/office/word/2010/wordprocessingCanvas" xmlns:cx="http://schemas.microsoft.com/office/drawing/2014/chartex" xmlns:cx1="http://schemas.microsoft.com/office/drawing/2015/9/8/chartex" xmlns:cx2="http://schemas.microsoft.com/office/drawing/2015/10/21/chartex" xmlns:cx3="http://schemas.microsoft.com/office/drawing/2016/5/9/chartex" xmlns:cx4="http://schemas.microsoft.com/office/drawing/2016/5/10/chartex" xmlns:cx5="http://schemas.microsoft.com/office/drawing/2016/5/11/chartex" xmlns:cx6="http://schemas.microsoft.com/office/drawing/2016/5/12/chartex" xmlns:cx7="http://schemas.microsoft.com/office/drawing/2016/5/13/chartex" xmlns:cx8="http://schemas.microsoft.com/office/drawing/2016/5/14/chartex" xmlns:mc="http://schemas.openxmlformats.org/markup-compatibility/2006" xmlns:aink="http://schemas.microsoft.com/office/drawing/2016/ink" xmlns:am3d="http://schemas.microsoft.com/office/drawing/2017/model3d" xmlns:o="urn:schemas-microsoft-com:office:office" xmlns:oel="http://schemas.microsoft.com/office/2019/extlst" xmlns:r="http://schemas.openxmlformats.org/officeDocument/2006/relationships" xmlns:m="http://schemas.openxmlformats.org/officeDocument/2006/math" xmlns:v="urn:schemas-microsoft-com:vml" xmlns:wp14="http://schemas.microsoft.com/office/word/2010/wordprocessingDrawing" xmlns:wp="http://schemas.openxmlformats.org/drawingml/2006/wordprocessingDrawing" xmlns:w10="urn:schemas-microsoft-com:office:word" xmlns:w="http://schemas.openxmlformats.org/wordprocessingml/2006/main" xmlns:w14="http://schemas.microsoft.com/office/word/2010/wordml" xmlns:w15="http://schemas.microsoft.com/office/word/2012/wordml" xmlns:w16cex="http://schemas.microsoft.com/office/word/2018/wordml/cex" xmlns:w16cid="http://schemas.microsoft.com/office/word/2016/wordml/cid" xmlns:w16="http://schemas.microsoft.com/office/word/2018/wordml" xmlns:w16du="http://schemas.microsoft.com/office/word/2023/wordml/word16du" xmlns:w16sdtdh="http://schemas.microsoft.com/office/word/2020/wordml/sdtdatahash" xmlns:w16sdtfl="http://schemas.microsoft.com/office/word/2024/wordml/sdtformatlock" xmlns:w16se="http://schemas.microsoft.com/office/word/2015/wordml/symex" xmlns:wpg="http://schemas.microsoft.com/office/word/2010/wordprocessingGroup" xmlns:wpi="http://schemas.microsoft.com/office/word/2010/wordprocessingInk" xmlns:wne="http://schemas.microsoft.com/office/word/2006/wordml" xmlns:wps="http://schemas.microsoft.com/office/word/2010/wordprocessingShape" mc:Ignorable="w14 w15 w16se w16cid w16 w16cex w16sdtdh w16sdtfl w16du wp14">
+  <w:p>
+    <w:pPr>
+      <w:pStyle w:val="Header"/>
+    </w:pPr>
+  </w:p>
+</w:hdr>
+</file>
+
+<file path=word/header2.xml><?xml version="1.0" encoding="utf-8"?>
+<w:hdr xmlns:wpc="http://schemas.microsoft.com/office/word/2010/wordprocessingCanvas" xmlns:cx="http://schemas.microsoft.com/office/drawing/2014/chartex" xmlns:cx1="http://schemas.microsoft.com/office/drawing/2015/9/8/chartex" xmlns:cx2="http://schemas.microsoft.com/office/drawing/2015/10/21/chartex" xmlns:cx3="http://schemas.microsoft.com/office/drawing/2016/5/9/chartex" xmlns:cx4="http://schemas.microsoft.com/office/drawing/2016/5/10/chartex" xmlns:cx5="http://schemas.microsoft.com/office/drawing/2016/5/11/chartex" xmlns:cx6="http://schemas.microsoft.com/office/drawing/2016/5/12/chartex" xmlns:cx7="http://schemas.microsoft.com/office/drawing/2016/5/13/chartex" xmlns:cx8="http://schemas.microsoft.com/office/drawing/2016/5/14/chartex" xmlns:mc="http://schemas.openxmlformats.org/markup-compatibility/2006" xmlns:aink="http://schemas.microsoft.com/office/drawing/2016/ink" xmlns:am3d="http://schemas.microsoft.com/office/drawing/2017/model3d" xmlns:o="urn:schemas-microsoft-com:office:office" xmlns:oel="http://schemas.microsoft.com/office/2019/extlst" xmlns:r="http://schemas.openxmlformats.org/officeDocument/2006/relationships" xmlns:m="http://schemas.openxmlformats.org/officeDocument/2006/math" xmlns:v="urn:schemas-microsoft-com:vml" xmlns:wp14="http://schemas.microsoft.com/office/word/2010/wordprocessingDrawing" xmlns:wp="http://schemas.openxmlformats.org/drawingml/2006/wordprocessingDrawing" xmlns:w10="urn:schemas-microsoft-com:office:word" xmlns:w="http://schemas.openxmlformats.org/wordprocessingml/2006/main" xmlns:w14="http://schemas.microsoft.com/office/word/2010/wordml" xmlns:w15="http://schemas.microsoft.com/office/word/2012/wordml" xmlns:w16cex="http://schemas.microsoft.com/office/word/2018/wordml/cex" xmlns:w16cid="http://schemas.microsoft.com/office/word/2016/wordml/cid" xmlns:w16="http://schemas.microsoft.com/office/word/2018/wordml" xmlns:w16du="http://schemas.microsoft.com/office/word/2023/wordml/word16du" xmlns:w16sdtdh="http://schemas.microsoft.com/office/word/2020/wordml/sdtdatahash" xmlns:w16sdtfl="http://schemas.microsoft.com/office/word/2024/wordml/sdtformatlock" xmlns:w16se="http://schemas.microsoft.com/office/word/2015/wordml/symex" xmlns:wpg="http://schemas.microsoft.com/office/word/2010/wordprocessingGroup" xmlns:wpi="http://schemas.microsoft.com/office/word/2010/wordprocessingInk" xmlns:wne="http://schemas.microsoft.com/office/word/2006/wordml" xmlns:wps="http://schemas.microsoft.com/office/word/2010/wordprocessingShape" mc:Ignorable="w14 w15 w16se w16cid w16 w16cex w16sdtdh w16sdtfl w16du wp14">
   <w:p>
     <w:pPr>
       <w:pStyle w:val="Header"/>
@@ -5089,6 +5181,105 @@
         <w:tab w:val="left" w:pos="4252"/>
       </w:tabs>
     </w:pPr>
+  </w:p>
+  <w:p>
+    <w:pPr>
+      <w:pStyle w:val="Header"/>
+      <w:tabs>
+        <w:tab w:val="clear" w:pos="8504"/>
+        <w:tab w:val="right" w:pos="9638"/>
+      </w:tabs>
+      <w:ind w:left="-284"/>
+      <w:rPr>
+        <w:rFonts w:asciiTheme="minorHAnsi" w:hAnsiTheme="minorHAnsi" w:cstheme="minorHAnsi"/>
+      </w:rPr>
+    </w:pPr>
+    <w:r>
+      <w:rPr>
+        <w:rFonts w:asciiTheme="minorHAnsi" w:hAnsiTheme="minorHAnsi" w:cstheme="minorHAnsi"/>
+        <w:noProof/>
+        <w:lang w:val="en-GB" w:eastAsia="en-GB"/>
+      </w:rPr>
+      <w:drawing>
+        <wp:inline distT="0" distB="0" distL="0" distR="0" wp14:anchorId="7FF61886" wp14:editId="01CE49BC">
+          <wp:extent cx="2228850" cy="419100"/>
+          <wp:effectExtent l="0" t="0" r="0" b="0"/>
+          <wp:docPr id="1083400343" name="Imagem 1083400343" descr="A black background with a black square&#10;&#10;AI-generated content may be incorrect."/>
+          <wp:cNvGraphicFramePr>
+            <a:graphicFrameLocks xmlns:a="http://schemas.openxmlformats.org/drawingml/2006/main" noChangeAspect="1"/>
+          </wp:cNvGraphicFramePr>
+          <a:graphic xmlns:a="http://schemas.openxmlformats.org/drawingml/2006/main">
+            <a:graphicData uri="http://schemas.openxmlformats.org/drawingml/2006/picture">
+              <pic:pic xmlns:pic="http://schemas.openxmlformats.org/drawingml/2006/picture">
+                <pic:nvPicPr>
+                  <pic:cNvPr id="1083400343" name="Imagem 1083400343" descr="A black background with a black square&#10;&#10;AI-generated content may be incorrect."/>
+                  <pic:cNvPicPr>
+                    <a:picLocks noChangeAspect="1" noChangeArrowheads="1"/>
+                  </pic:cNvPicPr>
+                </pic:nvPicPr>
+                <pic:blipFill rotWithShape="1">
+                  <a:blip r:embed="rId1">
+                    <a:extLst>
+                      <a:ext uri="{28A0092B-C50C-407E-A947-70E740481C1C}">
+                        <a14:useLocalDpi xmlns:a14="http://schemas.microsoft.com/office/drawing/2010/main" val="0"/>
+                      </a:ext>
+                    </a:extLst>
+                  </a:blip>
+                  <a:srcRect t="4959" r="63330" b="40496"/>
+                  <a:stretch/>
+                </pic:blipFill>
+                <pic:spPr bwMode="auto">
+                  <a:xfrm>
+                    <a:off x="0" y="0"/>
+                    <a:ext cx="2228850" cy="419100"/>
+                  </a:xfrm>
+                  <a:prstGeom prst="rect">
+                    <a:avLst/>
+                  </a:prstGeom>
+                  <a:noFill/>
+                  <a:ln>
+                    <a:noFill/>
+                  </a:ln>
+                  <a:extLst>
+                    <a:ext uri="{53640926-AAD7-44D8-BBD7-CCE9431645EC}">
+                      <a14:shadowObscured xmlns:a14="http://schemas.microsoft.com/office/drawing/2010/main"/>
+                    </a:ext>
+                  </a:extLst>
+                </pic:spPr>
+              </pic:pic>
+            </a:graphicData>
+          </a:graphic>
+        </wp:inline>
+      </w:drawing>
+    </w:r>
+    <w:r>
+      <w:rPr>
+        <w:rFonts w:asciiTheme="minorHAnsi" w:hAnsiTheme="minorHAnsi" w:cstheme="minorHAnsi"/>
+        <w:lang w:eastAsia="pt-PT"/>
+      </w:rPr>
+      <w:t xml:space="preserve">  </w:t>
+    </w:r>
+    <w:r>
+      <w:rPr>
+        <w:rFonts w:asciiTheme="minorHAnsi" w:hAnsiTheme="minorHAnsi" w:cstheme="minorHAnsi"/>
+        <w:lang w:eastAsia="pt-PT"/>
+      </w:rPr>
+      <w:tab/>
+    </w:r>
+    <w:r>
+      <w:rPr>
+        <w:rFonts w:asciiTheme="minorHAnsi" w:hAnsiTheme="minorHAnsi" w:cstheme="minorHAnsi"/>
+        <w:lang w:eastAsia="pt-PT"/>
+      </w:rPr>
+      <w:tab/>
+      <w:t xml:space="preserve">      [</w:t>
+    </w:r>
+    <w:r>
+      <w:rPr>
+        <w:rFonts w:asciiTheme="minorHAnsi" w:hAnsiTheme="minorHAnsi" w:cstheme="minorHAnsi"/>
+      </w:rPr>
+      <w:t>Espaço para logotipo do parceiro]</w:t>
+    </w:r>
   </w:p>
   <w:p>
     <w:pPr>
@@ -5404,8 +5595,8 @@
 </w:hdr>
 </file>
 
-<file path=word/header2.xml><?xml version="1.0" encoding="utf-8"?>
-<w:hdr xmlns:wpc="http://schemas.microsoft.com/office/word/2010/wordprocessingCanvas" xmlns:cx="http://schemas.microsoft.com/office/drawing/2014/chartex" xmlns:cx1="http://schemas.microsoft.com/office/drawing/2015/9/8/chartex" xmlns:cx2="http://schemas.microsoft.com/office/drawing/2015/10/21/chartex" xmlns:cx3="http://schemas.microsoft.com/office/drawing/2016/5/9/chartex" xmlns:cx4="http://schemas.microsoft.com/office/drawing/2016/5/10/chartex" xmlns:cx5="http://schemas.microsoft.com/office/drawing/2016/5/11/chartex" xmlns:cx6="http://schemas.microsoft.com/office/drawing/2016/5/12/chartex" xmlns:cx7="http://schemas.microsoft.com/office/drawing/2016/5/13/chartex" xmlns:cx8="http://schemas.microsoft.com/office/drawing/2016/5/14/chartex" xmlns:mc="http://schemas.openxmlformats.org/markup-compatibility/2006" xmlns:aink="http://schemas.microsoft.com/office/drawing/2016/ink" xmlns:am3d="http://schemas.microsoft.com/office/drawing/2017/model3d" xmlns:o="urn:schemas-microsoft-com:office:office" xmlns:oel="http://schemas.microsoft.com/office/2019/extlst" xmlns:r="http://schemas.openxmlformats.org/officeDocument/2006/relationships" xmlns:m="http://schemas.openxmlformats.org/officeDocument/2006/math" xmlns:v="urn:schemas-microsoft-com:vml" xmlns:wp14="http://schemas.microsoft.com/office/word/2010/wordprocessingDrawing" xmlns:wp="http://schemas.openxmlformats.org/drawingml/2006/wordprocessingDrawing" xmlns:w10="urn:schemas-microsoft-com:office:word" xmlns:w="http://schemas.openxmlformats.org/wordprocessingml/2006/main" xmlns:w14="http://schemas.microsoft.com/office/word/2010/wordml" xmlns:w15="http://schemas.microsoft.com/office/word/2012/wordml" xmlns:w16cex="http://schemas.microsoft.com/office/word/2018/wordml/cex" xmlns:w16cid="http://schemas.microsoft.com/office/word/2016/wordml/cid" xmlns:w16="http://schemas.microsoft.com/office/word/2018/wordml" xmlns:w16du="http://schemas.microsoft.com/office/word/2023/wordml/word16du" xmlns:w16sdtdh="http://schemas.microsoft.com/office/word/2020/wordml/sdtdatahash" xmlns:w16se="http://schemas.microsoft.com/office/word/2015/wordml/symex" xmlns:wpg="http://schemas.microsoft.com/office/word/2010/wordprocessingGroup" xmlns:wpi="http://schemas.microsoft.com/office/word/2010/wordprocessingInk" xmlns:wne="http://schemas.microsoft.com/office/word/2006/wordml" xmlns:wps="http://schemas.microsoft.com/office/word/2010/wordprocessingShape" mc:Ignorable="w14 w15 w16se w16cid w16 w16cex w16sdtdh w16du wp14">
+<file path=word/header3.xml><?xml version="1.0" encoding="utf-8"?>
+<w:hdr xmlns:wpc="http://schemas.microsoft.com/office/word/2010/wordprocessingCanvas" xmlns:cx="http://schemas.microsoft.com/office/drawing/2014/chartex" xmlns:cx1="http://schemas.microsoft.com/office/drawing/2015/9/8/chartex" xmlns:cx2="http://schemas.microsoft.com/office/drawing/2015/10/21/chartex" xmlns:cx3="http://schemas.microsoft.com/office/drawing/2016/5/9/chartex" xmlns:cx4="http://schemas.microsoft.com/office/drawing/2016/5/10/chartex" xmlns:cx5="http://schemas.microsoft.com/office/drawing/2016/5/11/chartex" xmlns:cx6="http://schemas.microsoft.com/office/drawing/2016/5/12/chartex" xmlns:cx7="http://schemas.microsoft.com/office/drawing/2016/5/13/chartex" xmlns:cx8="http://schemas.microsoft.com/office/drawing/2016/5/14/chartex" xmlns:mc="http://schemas.openxmlformats.org/markup-compatibility/2006" xmlns:aink="http://schemas.microsoft.com/office/drawing/2016/ink" xmlns:am3d="http://schemas.microsoft.com/office/drawing/2017/model3d" xmlns:o="urn:schemas-microsoft-com:office:office" xmlns:oel="http://schemas.microsoft.com/office/2019/extlst" xmlns:r="http://schemas.openxmlformats.org/officeDocument/2006/relationships" xmlns:m="http://schemas.openxmlformats.org/officeDocument/2006/math" xmlns:v="urn:schemas-microsoft-com:vml" xmlns:wp14="http://schemas.microsoft.com/office/word/2010/wordprocessingDrawing" xmlns:wp="http://schemas.openxmlformats.org/drawingml/2006/wordprocessingDrawing" xmlns:w10="urn:schemas-microsoft-com:office:word" xmlns:w="http://schemas.openxmlformats.org/wordprocessingml/2006/main" xmlns:w14="http://schemas.microsoft.com/office/word/2010/wordml" xmlns:w15="http://schemas.microsoft.com/office/word/2012/wordml" xmlns:w16cex="http://schemas.microsoft.com/office/word/2018/wordml/cex" xmlns:w16cid="http://schemas.microsoft.com/office/word/2016/wordml/cid" xmlns:w16="http://schemas.microsoft.com/office/word/2018/wordml" xmlns:w16du="http://schemas.microsoft.com/office/word/2023/wordml/word16du" xmlns:w16sdtdh="http://schemas.microsoft.com/office/word/2020/wordml/sdtdatahash" xmlns:w16sdtfl="http://schemas.microsoft.com/office/word/2024/wordml/sdtformatlock" xmlns:w16se="http://schemas.microsoft.com/office/word/2015/wordml/symex" xmlns:wpg="http://schemas.microsoft.com/office/word/2010/wordprocessingGroup" xmlns:wpi="http://schemas.microsoft.com/office/word/2010/wordprocessingInk" xmlns:wne="http://schemas.microsoft.com/office/word/2006/wordml" xmlns:wps="http://schemas.microsoft.com/office/word/2010/wordprocessingShape" mc:Ignorable="w14 w15 w16se w16cid w16 w16cex w16sdtdh w16sdtfl w16du wp14">
   <w:p>
     <w:pPr>
       <w:pStyle w:val="Header"/>
@@ -5609,7 +5800,7 @@
 </file>
 
 <file path=word/numbering.xml><?xml version="1.0" encoding="utf-8"?>
-<w:numbering xmlns:wpc="http://schemas.microsoft.com/office/word/2010/wordprocessingCanvas" xmlns:cx="http://schemas.microsoft.com/office/drawing/2014/chartex" xmlns:cx1="http://schemas.microsoft.com/office/drawing/2015/9/8/chartex" xmlns:cx2="http://schemas.microsoft.com/office/drawing/2015/10/21/chartex" xmlns:cx3="http://schemas.microsoft.com/office/drawing/2016/5/9/chartex" xmlns:cx4="http://schemas.microsoft.com/office/drawing/2016/5/10/chartex" xmlns:cx5="http://schemas.microsoft.com/office/drawing/2016/5/11/chartex" xmlns:cx6="http://schemas.microsoft.com/office/drawing/2016/5/12/chartex" xmlns:cx7="http://schemas.microsoft.com/office/drawing/2016/5/13/chartex" xmlns:cx8="http://schemas.microsoft.com/office/drawing/2016/5/14/chartex" xmlns:mc="http://schemas.openxmlformats.org/markup-compatibility/2006" xmlns:aink="http://schemas.microsoft.com/office/drawing/2016/ink" xmlns:am3d="http://schemas.microsoft.com/office/drawing/2017/model3d" xmlns:o="urn:schemas-microsoft-com:office:office" xmlns:oel="http://schemas.microsoft.com/office/2019/extlst" xmlns:r="http://schemas.openxmlformats.org/officeDocument/2006/relationships" xmlns:m="http://schemas.openxmlformats.org/officeDocument/2006/math" xmlns:v="urn:schemas-microsoft-com:vml" xmlns:wp14="http://schemas.microsoft.com/office/word/2010/wordprocessingDrawing" xmlns:wp="http://schemas.openxmlformats.org/drawingml/2006/wordprocessingDrawing" xmlns:w10="urn:schemas-microsoft-com:office:word" xmlns:w="http://schemas.openxmlformats.org/wordprocessingml/2006/main" xmlns:w14="http://schemas.microsoft.com/office/word/2010/wordml" xmlns:w15="http://schemas.microsoft.com/office/word/2012/wordml" xmlns:w16cex="http://schemas.microsoft.com/office/word/2018/wordml/cex" xmlns:w16cid="http://schemas.microsoft.com/office/word/2016/wordml/cid" xmlns:w16="http://schemas.microsoft.com/office/word/2018/wordml" xmlns:w16du="http://schemas.microsoft.com/office/word/2023/wordml/word16du" xmlns:w16sdtdh="http://schemas.microsoft.com/office/word/2020/wordml/sdtdatahash" xmlns:w16se="http://schemas.microsoft.com/office/word/2015/wordml/symex" xmlns:wpg="http://schemas.microsoft.com/office/word/2010/wordprocessingGroup" xmlns:wpi="http://schemas.microsoft.com/office/word/2010/wordprocessingInk" xmlns:wne="http://schemas.microsoft.com/office/word/2006/wordml" xmlns:wps="http://schemas.microsoft.com/office/word/2010/wordprocessingShape" mc:Ignorable="w14 w15 w16se w16cid w16 w16cex w16sdtdh w16du wp14">
+<w:numbering xmlns:wpc="http://schemas.microsoft.com/office/word/2010/wordprocessingCanvas" xmlns:cx="http://schemas.microsoft.com/office/drawing/2014/chartex" xmlns:cx1="http://schemas.microsoft.com/office/drawing/2015/9/8/chartex" xmlns:cx2="http://schemas.microsoft.com/office/drawing/2015/10/21/chartex" xmlns:cx3="http://schemas.microsoft.com/office/drawing/2016/5/9/chartex" xmlns:cx4="http://schemas.microsoft.com/office/drawing/2016/5/10/chartex" xmlns:cx5="http://schemas.microsoft.com/office/drawing/2016/5/11/chartex" xmlns:cx6="http://schemas.microsoft.com/office/drawing/2016/5/12/chartex" xmlns:cx7="http://schemas.microsoft.com/office/drawing/2016/5/13/chartex" xmlns:cx8="http://schemas.microsoft.com/office/drawing/2016/5/14/chartex" xmlns:mc="http://schemas.openxmlformats.org/markup-compatibility/2006" xmlns:aink="http://schemas.microsoft.com/office/drawing/2016/ink" xmlns:am3d="http://schemas.microsoft.com/office/drawing/2017/model3d" xmlns:o="urn:schemas-microsoft-com:office:office" xmlns:oel="http://schemas.microsoft.com/office/2019/extlst" xmlns:r="http://schemas.openxmlformats.org/officeDocument/2006/relationships" xmlns:m="http://schemas.openxmlformats.org/officeDocument/2006/math" xmlns:v="urn:schemas-microsoft-com:vml" xmlns:wp14="http://schemas.microsoft.com/office/word/2010/wordprocessingDrawing" xmlns:wp="http://schemas.openxmlformats.org/drawingml/2006/wordprocessingDrawing" xmlns:w10="urn:schemas-microsoft-com:office:word" xmlns:w="http://schemas.openxmlformats.org/wordprocessingml/2006/main" xmlns:w14="http://schemas.microsoft.com/office/word/2010/wordml" xmlns:w15="http://schemas.microsoft.com/office/word/2012/wordml" xmlns:w16cex="http://schemas.microsoft.com/office/word/2018/wordml/cex" xmlns:w16cid="http://schemas.microsoft.com/office/word/2016/wordml/cid" xmlns:w16="http://schemas.microsoft.com/office/word/2018/wordml" xmlns:w16du="http://schemas.microsoft.com/office/word/2023/wordml/word16du" xmlns:w16sdtdh="http://schemas.microsoft.com/office/word/2020/wordml/sdtdatahash" xmlns:w16sdtfl="http://schemas.microsoft.com/office/word/2024/wordml/sdtformatlock" xmlns:w16se="http://schemas.microsoft.com/office/word/2015/wordml/symex" xmlns:wpg="http://schemas.microsoft.com/office/word/2010/wordprocessingGroup" xmlns:wpi="http://schemas.microsoft.com/office/word/2010/wordprocessingInk" xmlns:wne="http://schemas.microsoft.com/office/word/2006/wordml" xmlns:wps="http://schemas.microsoft.com/office/word/2010/wordprocessingShape" mc:Ignorable="w14 w15 w16se w16cid w16 w16cex w16sdtdh w16sdtfl w16du wp14">
   <w:abstractNum w:abstractNumId="0" w15:restartNumberingAfterBreak="0">
     <w:nsid w:val="015E0EEA"/>
     <w:multiLevelType w:val="hybridMultilevel"/>
@@ -7956,7 +8147,7 @@
   <w:num w:numId="23" w16cid:durableId="1380006835">
     <w:abstractNumId w:val="18"/>
     <w:lvlOverride w:ilvl="0">
-      <w:lvl w:ilvl="0" w:tplc="90966388">
+      <w:lvl w:ilvl="0" w:tplc="241C8DD4">
         <w:start w:val="1"/>
         <w:numFmt w:val="decimal"/>
         <w:lvlText w:val="%1."/>
@@ -7987,7 +8178,7 @@
 </file>
 
 <file path=word/styles.xml><?xml version="1.0" encoding="utf-8"?>
-<w:styles xmlns:mc="http://schemas.openxmlformats.org/markup-compatibility/2006" xmlns:r="http://schemas.openxmlformats.org/officeDocument/2006/relationships" xmlns:w="http://schemas.openxmlformats.org/wordprocessingml/2006/main" xmlns:w14="http://schemas.microsoft.com/office/word/2010/wordml" xmlns:w15="http://schemas.microsoft.com/office/word/2012/wordml" xmlns:w16cex="http://schemas.microsoft.com/office/word/2018/wordml/cex" xmlns:w16cid="http://schemas.microsoft.com/office/word/2016/wordml/cid" xmlns:w16="http://schemas.microsoft.com/office/word/2018/wordml" xmlns:w16du="http://schemas.microsoft.com/office/word/2023/wordml/word16du" xmlns:w16sdtdh="http://schemas.microsoft.com/office/word/2020/wordml/sdtdatahash" xmlns:w16se="http://schemas.microsoft.com/office/word/2015/wordml/symex" mc:Ignorable="w14 w15 w16se w16cid w16 w16cex w16sdtdh w16du">
+<w:styles xmlns:mc="http://schemas.openxmlformats.org/markup-compatibility/2006" xmlns:r="http://schemas.openxmlformats.org/officeDocument/2006/relationships" xmlns:w="http://schemas.openxmlformats.org/wordprocessingml/2006/main" xmlns:w14="http://schemas.microsoft.com/office/word/2010/wordml" xmlns:w15="http://schemas.microsoft.com/office/word/2012/wordml" xmlns:w16cex="http://schemas.microsoft.com/office/word/2018/wordml/cex" xmlns:w16cid="http://schemas.microsoft.com/office/word/2016/wordml/cid" xmlns:w16="http://schemas.microsoft.com/office/word/2018/wordml" xmlns:w16du="http://schemas.microsoft.com/office/word/2023/wordml/word16du" xmlns:w16sdtdh="http://schemas.microsoft.com/office/word/2020/wordml/sdtdatahash" xmlns:w16sdtfl="http://schemas.microsoft.com/office/word/2024/wordml/sdtformatlock" xmlns:w16se="http://schemas.microsoft.com/office/word/2015/wordml/symex" mc:Ignorable="w14 w15 w16se w16cid w16 w16cex w16sdtdh w16sdtfl w16du">
   <w:docDefaults>
     <w:rPrDefault>
       <w:rPr>
@@ -9000,16 +9191,6 @@
 </file>
 
 <file path=customXml/item1.xml><?xml version="1.0" encoding="utf-8"?>
-<p:properties xmlns:p="http://schemas.microsoft.com/office/2006/metadata/properties" xmlns:xsi="http://www.w3.org/2001/XMLSchema-instance" xmlns:pc="http://schemas.microsoft.com/office/infopath/2007/PartnerControls">
-  <documentManagement/>
-</p:properties>
-</file>
-
-<file path=customXml/item2.xml><?xml version="1.0" encoding="utf-8"?>
-<b:Sources xmlns:b="http://schemas.openxmlformats.org/officeDocument/2006/bibliography" xmlns="http://schemas.openxmlformats.org/officeDocument/2006/bibliography" SelectedStyle="\APA.XSL" StyleName="APA"/>
-</file>
-
-<file path=customXml/item3.xml><?xml version="1.0" encoding="utf-8"?>
 <?mso-contentType ?>
 <FormTemplates xmlns="http://schemas.microsoft.com/sharepoint/v3/contenttype/forms">
   <Display>DocumentLibraryForm</Display>
@@ -9018,7 +9199,49 @@
 </FormTemplates>
 </file>
 
+<file path=customXml/item2.xml><?xml version="1.0" encoding="utf-8"?>
+<b:Sources xmlns:b="http://schemas.openxmlformats.org/officeDocument/2006/bibliography" xmlns="http://schemas.openxmlformats.org/officeDocument/2006/bibliography" SelectedStyle="\APA.XSL" StyleName="APA"/>
+</file>
+
+<file path=customXml/item3.xml><?xml version="1.0" encoding="utf-8"?>
+<p:properties xmlns:p="http://schemas.microsoft.com/office/2006/metadata/properties" xmlns:xsi="http://www.w3.org/2001/XMLSchema-instance" xmlns:pc="http://schemas.microsoft.com/office/infopath/2007/PartnerControls">
+  <documentManagement/>
+</p:properties>
+</file>
+
 <file path=customXml/item4.xml><?xml version="1.0" encoding="utf-8"?>
+<f:fields xmlns:f="http://schemas.fabasoft.com/folio/2007/fields">
+  <f:record>
+    <f:field ref="objname" par="" text="AMA_Protocolo_CMD_Autenticação_Assinatura_Privados" edit="true"/>
+    <f:field ref="objsubject" par="" text="" edit="true"/>
+    <f:field ref="objcreatedby" par="" text="Joana Pires"/>
+    <f:field ref="objcreatedat" par="" date="2022-01-19T16:09:07" text="19/01/2022 16:09:07"/>
+    <f:field ref="objchangedby" par="" text="Joana Pires"/>
+    <f:field ref="objmodifiedat" par="" date="2022-01-19T16:09:07" text="19/01/2022 16:09:07"/>
+    <f:field ref="doc_FSCFOLIO_1_1001_FieldDocumentNumber" par="" text=""/>
+    <f:field ref="doc_FSCFOLIO_1_1001_FieldSubject" par="" text="" edit="true"/>
+    <f:field ref="FSCFOLIO_1_1001_FieldCurrentUser" par="" text="Joana Pires"/>
+    <f:field ref="CCAPRECONFIG_15_1001_Objektname" par="" text="AMA_Protocolo_CMD_Autenticação_Assinatura_Privados" edit="true"/>
+    <f:field ref="CCAPRECONFIG_15_1001_Objektname" par="" text="AMA_Protocolo_CMD_Autenticação_Assinatura_Privados" edit="true"/>
+  </f:record>
+  <f:display par="" text="General">
+    <f:field ref="objname" text="Nome"/>
+    <f:field ref="objsubject" text="Assunto"/>
+    <f:field ref="objcreatedby" text="Criado por"/>
+    <f:field ref="objcreatedat" text="Criado em/às"/>
+    <f:field ref="objchangedby" text="Última alteração por"/>
+    <f:field ref="objmodifiedat" text="Última alteração em/às"/>
+    <f:field ref="FSCFOLIO_1_1001_FieldCurrentUser" text="Utilizador actual"/>
+    <f:field ref="CCAPRECONFIG_15_1001_Objektname" text="Objektname"/>
+  </f:display>
+  <f:display par="" text="Carta em série">
+    <f:field ref="doc_FSCFOLIO_1_1001_FieldDocumentNumber" text="Número do documento"/>
+    <f:field ref="doc_FSCFOLIO_1_1001_FieldSubject" text="Assunto"/>
+  </f:display>
+</f:fields>
+</file>
+
+<file path=customXml/item5.xml><?xml version="1.0" encoding="utf-8"?>
 <ct:contentTypeSchema xmlns:ct="http://schemas.microsoft.com/office/2006/metadata/contentType" xmlns:ma="http://schemas.microsoft.com/office/2006/metadata/properties/metaAttributes" ct:_="" ma:_="" ma:contentTypeName="Documento" ma:contentTypeID="0x0101005B33CE0989C7C04FAC1059BFCF2AA9C9" ma:contentTypeVersion="12" ma:contentTypeDescription="Criar um novo documento." ma:contentTypeScope="" ma:versionID="64f3ecc5ecdce8036863e73af23c9e95">
   <xsd:schema xmlns:xsd="http://www.w3.org/2001/XMLSchema" xmlns:xs="http://www.w3.org/2001/XMLSchema" xmlns:p="http://schemas.microsoft.com/office/2006/metadata/properties" xmlns:ns2="29131337-9f48-4dd8-8094-a140ac1e3b23" xmlns:ns3="ee0d3de4-1e47-4168-94db-bd82c32bb80b" targetNamespace="http://schemas.microsoft.com/office/2006/metadata/properties" ma:root="true" ma:fieldsID="cd8d3b229c0ebe245858252c2b788675" ns2:_="" ns3:_="">
     <xsd:import namespace="29131337-9f48-4dd8-8094-a140ac1e3b23"/>
@@ -9235,43 +9458,10 @@
 </ct:contentTypeSchema>
 </file>
 
-<file path=customXml/item5.xml><?xml version="1.0" encoding="utf-8"?>
-<f:fields xmlns:f="http://schemas.fabasoft.com/folio/2007/fields">
-  <f:record>
-    <f:field ref="objname" par="" text="AMA_Protocolo_CMD_Autenticação_Assinatura_Privados" edit="true"/>
-    <f:field ref="objsubject" par="" text="" edit="true"/>
-    <f:field ref="objcreatedby" par="" text="Joana Pires"/>
-    <f:field ref="objcreatedat" par="" date="2022-01-19T16:09:07" text="19/01/2022 16:09:07"/>
-    <f:field ref="objchangedby" par="" text="Joana Pires"/>
-    <f:field ref="objmodifiedat" par="" date="2022-01-19T16:09:07" text="19/01/2022 16:09:07"/>
-    <f:field ref="doc_FSCFOLIO_1_1001_FieldDocumentNumber" par="" text=""/>
-    <f:field ref="doc_FSCFOLIO_1_1001_FieldSubject" par="" text="" edit="true"/>
-    <f:field ref="FSCFOLIO_1_1001_FieldCurrentUser" par="" text="Joana Pires"/>
-    <f:field ref="CCAPRECONFIG_15_1001_Objektname" par="" text="AMA_Protocolo_CMD_Autenticação_Assinatura_Privados" edit="true"/>
-    <f:field ref="CCAPRECONFIG_15_1001_Objektname" par="" text="AMA_Protocolo_CMD_Autenticação_Assinatura_Privados" edit="true"/>
-  </f:record>
-  <f:display par="" text="General">
-    <f:field ref="objname" text="Nome"/>
-    <f:field ref="objsubject" text="Assunto"/>
-    <f:field ref="objcreatedby" text="Criado por"/>
-    <f:field ref="objcreatedat" text="Criado em/às"/>
-    <f:field ref="objchangedby" text="Última alteração por"/>
-    <f:field ref="objmodifiedat" text="Última alteração em/às"/>
-    <f:field ref="FSCFOLIO_1_1001_FieldCurrentUser" text="Utilizador actual"/>
-    <f:field ref="CCAPRECONFIG_15_1001_Objektname" text="Objektname"/>
-  </f:display>
-  <f:display par="" text="Carta em série">
-    <f:field ref="doc_FSCFOLIO_1_1001_FieldDocumentNumber" text="Número do documento"/>
-    <f:field ref="doc_FSCFOLIO_1_1001_FieldSubject" text="Assunto"/>
-  </f:display>
-</f:fields>
-</file>
-
 <file path=customXml/itemProps1.xml><?xml version="1.0" encoding="utf-8"?>
-<ds:datastoreItem xmlns:ds="http://schemas.openxmlformats.org/officeDocument/2006/customXml" ds:itemID="{46B33C52-174D-4099-B158-9F4BD6EE461F}">
+<ds:datastoreItem xmlns:ds="http://schemas.openxmlformats.org/officeDocument/2006/customXml" ds:itemID="{C014179D-6901-4F5C-B083-7DF14112A13F}">
   <ds:schemaRefs>
-    <ds:schemaRef ds:uri="http://schemas.microsoft.com/office/2006/metadata/properties"/>
-    <ds:schemaRef ds:uri="http://schemas.microsoft.com/office/infopath/2007/PartnerControls"/>
+    <ds:schemaRef ds:uri="http://schemas.microsoft.com/sharepoint/v3/contenttype/forms"/>
   </ds:schemaRefs>
 </ds:datastoreItem>
 </file>
@@ -9285,14 +9475,23 @@
 </file>
 
 <file path=customXml/itemProps3.xml><?xml version="1.0" encoding="utf-8"?>
-<ds:datastoreItem xmlns:ds="http://schemas.openxmlformats.org/officeDocument/2006/customXml" ds:itemID="{C014179D-6901-4F5C-B083-7DF14112A13F}">
+<ds:datastoreItem xmlns:ds="http://schemas.openxmlformats.org/officeDocument/2006/customXml" ds:itemID="{46B33C52-174D-4099-B158-9F4BD6EE461F}">
   <ds:schemaRefs>
-    <ds:schemaRef ds:uri="http://schemas.microsoft.com/sharepoint/v3/contenttype/forms"/>
+    <ds:schemaRef ds:uri="http://schemas.microsoft.com/office/2006/metadata/properties"/>
+    <ds:schemaRef ds:uri="http://schemas.microsoft.com/office/infopath/2007/PartnerControls"/>
   </ds:schemaRefs>
 </ds:datastoreItem>
 </file>
 
 <file path=customXml/itemProps4.xml><?xml version="1.0" encoding="utf-8"?>
+<ds:datastoreItem xmlns:ds="http://schemas.openxmlformats.org/officeDocument/2006/customXml" ds:itemID="{4E8A9591-F074-446B-902F-511FF79C122F}">
+  <ds:schemaRefs>
+    <ds:schemaRef ds:uri="http://schemas.fabasoft.com/folio/2007/fields"/>
+  </ds:schemaRefs>
+</ds:datastoreItem>
+</file>
+
+<file path=customXml/itemProps5.xml><?xml version="1.0" encoding="utf-8"?>
 <ds:datastoreItem xmlns:ds="http://schemas.openxmlformats.org/officeDocument/2006/customXml" ds:itemID="{5BB9B586-B53C-4BC6-B9DC-467783CAEB83}">
   <ds:schemaRefs>
     <ds:schemaRef ds:uri="http://schemas.microsoft.com/office/2006/metadata/contentType"/>
@@ -9309,12 +9508,4 @@
     <ds:schemaRef ds:uri="http://schemas.microsoft.com/internal/obd"/>
   </ds:schemaRefs>
 </ds:datastoreItem>
-</file>
-
-<file path=customXml/itemProps5.xml><?xml version="1.0" encoding="utf-8"?>
-<ds:datastoreItem xmlns:ds="http://schemas.openxmlformats.org/officeDocument/2006/customXml" ds:itemID="{4E8A9591-F074-446B-902F-511FF79C122F}">
-  <ds:schemaRefs>
-    <ds:schemaRef ds:uri="http://schemas.fabasoft.com/folio/2007/fields"/>
-  </ds:schemaRefs>
-</ds:datastoreItem>
 </file>
</xml_diff>

<commit_message>
Atualização de minutas de protocolo
</commit_message>
<xml_diff>
--- a/protocolos_minutas/AMA_Protocolo_CMD_Autenticação_Assinatura_Privados_.docx
+++ b/protocolos_minutas/AMA_Protocolo_CMD_Autenticação_Assinatura_Privados_.docx
@@ -22,12 +22,83 @@
       </w:r>
       <w:r>
         <w:rPr>
+          <w:rFonts w:asciiTheme="minorHAnsi" w:hAnsiTheme="minorHAnsi"/>
+          <w:b/>
+          <w:bCs/>
+        </w:rPr>
+        <w:t>A</w:t>
+      </w:r>
+      <w:r>
+        <w:rPr>
+          <w:rFonts w:asciiTheme="minorHAnsi" w:hAnsiTheme="minorHAnsi"/>
+          <w:b/>
+        </w:rPr>
+        <w:t xml:space="preserve">gência </w:t>
+      </w:r>
+      <w:r>
+        <w:rPr>
+          <w:rFonts w:asciiTheme="minorHAnsi" w:hAnsiTheme="minorHAnsi"/>
+          <w:b/>
+        </w:rPr>
+        <w:t>p</w:t>
+      </w:r>
+      <w:r>
+        <w:rPr>
+          <w:rFonts w:asciiTheme="minorHAnsi" w:hAnsiTheme="minorHAnsi"/>
+          <w:b/>
+        </w:rPr>
+        <w:t xml:space="preserve">ara a </w:t>
+      </w:r>
+      <w:r>
+        <w:rPr>
+          <w:rFonts w:asciiTheme="minorHAnsi" w:hAnsiTheme="minorHAnsi"/>
+          <w:b/>
+        </w:rPr>
+        <w:t>R</w:t>
+      </w:r>
+      <w:r>
+        <w:rPr>
+          <w:rFonts w:asciiTheme="minorHAnsi" w:hAnsiTheme="minorHAnsi"/>
+          <w:b/>
+        </w:rPr>
+        <w:t xml:space="preserve">eforma </w:t>
+      </w:r>
+      <w:r>
+        <w:rPr>
+          <w:rFonts w:asciiTheme="minorHAnsi" w:hAnsiTheme="minorHAnsi"/>
+          <w:b/>
+        </w:rPr>
+        <w:t>T</w:t>
+      </w:r>
+      <w:r>
+        <w:rPr>
+          <w:rFonts w:asciiTheme="minorHAnsi" w:hAnsiTheme="minorHAnsi"/>
+          <w:b/>
+        </w:rPr>
+        <w:t xml:space="preserve">ecnológica do </w:t>
+      </w:r>
+      <w:r>
+        <w:rPr>
+          <w:rFonts w:asciiTheme="minorHAnsi" w:hAnsiTheme="minorHAnsi"/>
+          <w:b/>
+        </w:rPr>
+        <w:t>E</w:t>
+      </w:r>
+      <w:r>
+        <w:rPr>
+          <w:rFonts w:asciiTheme="minorHAnsi" w:hAnsiTheme="minorHAnsi"/>
+          <w:b/>
+        </w:rPr>
+        <w:t>stado</w:t>
+      </w:r>
+      <w:r>
+        <w:rPr>
           <w:rFonts w:eastAsia="Calibri" w:cs="Calibri"/>
           <w:b/>
           <w:bCs/>
           <w:spacing w:val="1"/>
         </w:rPr>
-        <w:t>Agência para a Modernização Administrativa, IP,</w:t>
+        <w:t>, IP,</w:t>
       </w:r>
       <w:r>
         <w:rPr>
@@ -43,7 +114,7 @@
           <w:bCs/>
           <w:spacing w:val="1"/>
         </w:rPr>
-        <w:t>AMA</w:t>
+        <w:t>ARTE</w:t>
       </w:r>
       <w:r>
         <w:rPr>
@@ -410,7 +481,13 @@
         <w:rPr>
           <w:rFonts w:asciiTheme="minorHAnsi" w:hAnsiTheme="minorHAnsi"/>
         </w:rPr>
-        <w:t xml:space="preserve"> prevê um sistema alternativo e voluntário de autenticação segura em sítios na Internet, mediante acordo celebrado com a AMA</w:t>
+        <w:t xml:space="preserve"> prevê um sistema alternativo e voluntário de autenticação segura em sítios na Internet, mediante acordo celebrado com a </w:t>
+      </w:r>
+      <w:r>
+        <w:rPr>
+          <w:rFonts w:asciiTheme="minorHAnsi" w:hAnsiTheme="minorHAnsi"/>
+        </w:rPr>
+        <w:t>ARTE</w:t>
       </w:r>
       <w:r>
         <w:rPr>
@@ -554,7 +631,7 @@
         <w:rPr>
           <w:rFonts w:asciiTheme="minorHAnsi" w:hAnsiTheme="minorHAnsi"/>
         </w:rPr>
-        <w:t>AMA</w:t>
+        <w:t>ARTE</w:t>
       </w:r>
       <w:r>
         <w:rPr>
@@ -589,14 +666,8 @@
         <w:rPr>
           <w:rFonts w:asciiTheme="minorHAnsi" w:hAnsiTheme="minorHAnsi"/>
         </w:rPr>
-        <w:t xml:space="preserve">Nos termos do n.º 11 do artigo 2.º da Lei n.º 37/2014, de 26 de junho, na sua redação atual, e do n.º </w:t>
-      </w:r>
-      <w:r>
-        <w:rPr>
-          <w:rFonts w:asciiTheme="minorHAnsi" w:hAnsiTheme="minorHAnsi"/>
-        </w:rPr>
         <w:lastRenderedPageBreak/>
-        <w:t xml:space="preserve">3 do artigo 11.º da Portaria n.º 77/2018, de 16 de março, </w:t>
+        <w:t xml:space="preserve">Nos termos do n.º 11 do artigo 2.º da Lei n.º 37/2014, de 26 de junho, na sua redação atual, e do n.º 3 do artigo 11.º da Portaria n.º 77/2018, de 16 de março, </w:t>
       </w:r>
       <w:r>
         <w:rPr>
@@ -644,7 +715,19 @@
         <w:rPr>
           <w:rFonts w:asciiTheme="minorHAnsi" w:hAnsiTheme="minorHAnsi"/>
         </w:rPr>
-        <w:t xml:space="preserve"> dos cidadãos nos respetivos sistemas e sítios da Internet, celebram para o efeito protocolo com a AMA, sendo aplicáveis as taxas que forem estabelecidas para a utilização da Chave Móvel Digital, às quais acresce o IVA à taxa legal em vigor;</w:t>
+        <w:t xml:space="preserve"> dos cidadãos nos respetivos sistemas e sítios da Internet, celebram para o efeito protocolo com a </w:t>
+      </w:r>
+      <w:r>
+        <w:rPr>
+          <w:rFonts w:asciiTheme="minorHAnsi" w:hAnsiTheme="minorHAnsi"/>
+        </w:rPr>
+        <w:t>ARTE</w:t>
+      </w:r>
+      <w:r>
+        <w:rPr>
+          <w:rFonts w:asciiTheme="minorHAnsi" w:hAnsiTheme="minorHAnsi"/>
+        </w:rPr>
+        <w:t>, sendo aplicáveis as taxas que forem estabelecidas para a utilização da Chave Móvel Digital, às quais acresce o IVA à taxa legal em vigor;</w:t>
       </w:r>
     </w:p>
     <w:p>
@@ -758,7 +841,19 @@
         <w:rPr>
           <w:rFonts w:asciiTheme="minorHAnsi" w:hAnsiTheme="minorHAnsi"/>
         </w:rPr>
-        <w:t>rotocolo não estão nem são suscetíveis de estar submetidas à concorrência de mercado, uma vez que a AMA det</w:t>
+        <w:t xml:space="preserve">rotocolo não estão nem são suscetíveis de estar submetidas à concorrência de mercado, uma vez que a </w:t>
+      </w:r>
+      <w:r>
+        <w:rPr>
+          <w:rFonts w:asciiTheme="minorHAnsi" w:hAnsiTheme="minorHAnsi"/>
+        </w:rPr>
+        <w:t>ARTE</w:t>
+      </w:r>
+      <w:r>
+        <w:rPr>
+          <w:rFonts w:asciiTheme="minorHAnsi" w:hAnsiTheme="minorHAnsi"/>
+        </w:rPr>
+        <w:t xml:space="preserve"> det</w:t>
       </w:r>
       <w:r>
         <w:rPr>
@@ -1045,6 +1140,7 @@
           <w:rFonts w:asciiTheme="minorHAnsi" w:hAnsiTheme="minorHAnsi"/>
           <w:b/>
         </w:rPr>
+        <w:lastRenderedPageBreak/>
         <w:t>Obrigações da Primeira Outorgante</w:t>
       </w:r>
     </w:p>
@@ -1074,7 +1170,19 @@
         <w:rPr>
           <w:rFonts w:asciiTheme="minorHAnsi" w:hAnsiTheme="minorHAnsi"/>
         </w:rPr>
-        <w:t xml:space="preserve"> a AMA obriga-se a:</w:t>
+        <w:t xml:space="preserve"> a </w:t>
+      </w:r>
+      <w:r>
+        <w:rPr>
+          <w:rFonts w:asciiTheme="minorHAnsi" w:hAnsiTheme="minorHAnsi"/>
+        </w:rPr>
+        <w:t>ARTE</w:t>
+      </w:r>
+      <w:r>
+        <w:rPr>
+          <w:rFonts w:asciiTheme="minorHAnsi" w:hAnsiTheme="minorHAnsi"/>
+        </w:rPr>
+        <w:t xml:space="preserve"> obriga-se a:</w:t>
       </w:r>
     </w:p>
     <w:p>
@@ -1099,7 +1207,6 @@
         <w:rPr>
           <w:rFonts w:asciiTheme="minorHAnsi" w:hAnsiTheme="minorHAnsi"/>
         </w:rPr>
-        <w:lastRenderedPageBreak/>
         <w:t xml:space="preserve">Disponibilizar </w:t>
       </w:r>
       <w:r>
@@ -1610,7 +1717,19 @@
         <w:rPr>
           <w:rFonts w:asciiTheme="minorHAnsi" w:hAnsiTheme="minorHAnsi"/>
         </w:rPr>
-        <w:t>Utilizar o serviço de acordo com os requisitos tecnológicos indicados pela AMA e somente para as finalidades previstas na Cláusula Primeira deste Protocolo;</w:t>
+        <w:t xml:space="preserve">Utilizar o serviço de acordo com os requisitos tecnológicos indicados pela </w:t>
+      </w:r>
+      <w:r>
+        <w:rPr>
+          <w:rFonts w:asciiTheme="minorHAnsi" w:hAnsiTheme="minorHAnsi"/>
+        </w:rPr>
+        <w:t>ARTE</w:t>
+      </w:r>
+      <w:r>
+        <w:rPr>
+          <w:rFonts w:asciiTheme="minorHAnsi" w:hAnsiTheme="minorHAnsi"/>
+        </w:rPr>
+        <w:t xml:space="preserve"> e somente para as finalidades previstas na Cláusula Primeira deste Protocolo;</w:t>
       </w:r>
     </w:p>
     <w:p>
@@ -1659,7 +1778,19 @@
         <w:rPr>
           <w:rFonts w:asciiTheme="minorHAnsi" w:hAnsiTheme="minorHAnsi"/>
         </w:rPr>
-        <w:t xml:space="preserve"> que venha a indicar à AMA;</w:t>
+        <w:t xml:space="preserve"> que venha a indicar à </w:t>
+      </w:r>
+      <w:r>
+        <w:rPr>
+          <w:rFonts w:asciiTheme="minorHAnsi" w:hAnsiTheme="minorHAnsi"/>
+        </w:rPr>
+        <w:t>ARTE</w:t>
+      </w:r>
+      <w:r>
+        <w:rPr>
+          <w:rFonts w:asciiTheme="minorHAnsi" w:hAnsiTheme="minorHAnsi"/>
+        </w:rPr>
+        <w:t>;</w:t>
       </w:r>
     </w:p>
     <w:p>
@@ -1702,7 +1833,19 @@
         <w:rPr>
           <w:rFonts w:asciiTheme="minorHAnsi" w:hAnsiTheme="minorHAnsi"/>
         </w:rPr>
-        <w:t xml:space="preserve"> o interface gráfico de acesso ao serviço Autenticação.Gov de acordo com orientações definidas pela AMA;</w:t>
+        <w:t xml:space="preserve"> o interface gráfico de acesso ao serviço Autenticação.Gov de acordo com orientações definidas pela </w:t>
+      </w:r>
+      <w:r>
+        <w:rPr>
+          <w:rFonts w:asciiTheme="minorHAnsi" w:hAnsiTheme="minorHAnsi"/>
+        </w:rPr>
+        <w:t>ARTE</w:t>
+      </w:r>
+      <w:r>
+        <w:rPr>
+          <w:rFonts w:asciiTheme="minorHAnsi" w:hAnsiTheme="minorHAnsi"/>
+        </w:rPr>
+        <w:t>;</w:t>
       </w:r>
     </w:p>
     <w:p>
@@ -1819,7 +1962,14 @@
         <w:rPr>
           <w:rFonts w:asciiTheme="minorHAnsi" w:hAnsiTheme="minorHAnsi"/>
         </w:rPr>
-        <w:t>Adotar as medidas técnicas e de organização apropriadas à proteção da informação contra a destruição acidental ou não autorizada, a perda acidental, a alteração e o acesso ou qualquer outro tratamento não autorizado de dados;</w:t>
+        <w:t xml:space="preserve">Adotar as medidas técnicas e de organização apropriadas à proteção da informação contra a destruição acidental ou não autorizada, a perda acidental, a alteração e o acesso ou qualquer outro </w:t>
+      </w:r>
+      <w:r>
+        <w:rPr>
+          <w:rFonts w:asciiTheme="minorHAnsi" w:hAnsiTheme="minorHAnsi"/>
+        </w:rPr>
+        <w:lastRenderedPageBreak/>
+        <w:t>tratamento não autorizado de dados;</w:t>
       </w:r>
     </w:p>
     <w:p>
@@ -1868,14 +2018,7 @@
         <w:rPr>
           <w:rFonts w:asciiTheme="minorHAnsi" w:hAnsiTheme="minorHAnsi"/>
         </w:rPr>
-        <w:t xml:space="preserve"> relativamente às componentes sob a sua </w:t>
-      </w:r>
-      <w:r>
-        <w:rPr>
-          <w:rFonts w:asciiTheme="minorHAnsi" w:hAnsiTheme="minorHAnsi"/>
-        </w:rPr>
-        <w:lastRenderedPageBreak/>
-        <w:t>responsabilidade;</w:t>
+        <w:t xml:space="preserve"> relativamente às componentes sob a sua responsabilidade;</w:t>
       </w:r>
     </w:p>
     <w:p>
@@ -1900,7 +2043,19 @@
         <w:rPr>
           <w:rFonts w:asciiTheme="minorHAnsi" w:hAnsiTheme="minorHAnsi"/>
         </w:rPr>
-        <w:t>O recurso a criptografia no estabelecimento de comunicação via Internet com a AMA;</w:t>
+        <w:t xml:space="preserve">O recurso a criptografia no estabelecimento de comunicação via Internet com a </w:t>
+      </w:r>
+      <w:r>
+        <w:rPr>
+          <w:rFonts w:asciiTheme="minorHAnsi" w:hAnsiTheme="minorHAnsi"/>
+        </w:rPr>
+        <w:t>ARTE</w:t>
+      </w:r>
+      <w:r>
+        <w:rPr>
+          <w:rFonts w:asciiTheme="minorHAnsi" w:hAnsiTheme="minorHAnsi"/>
+        </w:rPr>
+        <w:t>;</w:t>
       </w:r>
     </w:p>
     <w:p>
@@ -1922,7 +2077,13 @@
         </w:rPr>
       </w:pPr>
       <w:r>
-        <w:t>Informar a AMA com uma antecedência de 30</w:t>
+        <w:t xml:space="preserve">Informar a </w:t>
+      </w:r>
+      <w:r>
+        <w:t>ARTE</w:t>
+      </w:r>
+      <w:r>
+        <w:t xml:space="preserve"> com uma antecedência de 30</w:t>
       </w:r>
       <w:r>
         <w:t xml:space="preserve"> (trinta)</w:t>
@@ -2023,7 +2184,13 @@
         <w:rPr>
           <w:rFonts w:asciiTheme="minorHAnsi" w:hAnsiTheme="minorHAnsi"/>
         </w:rPr>
-        <w:t xml:space="preserve"> para implementação de aplicação de assinatura constantes da documentação disponibilizada pela AMA</w:t>
+        <w:t xml:space="preserve"> para implementação de aplicação de assinatura constantes da documentação disponibilizada pela </w:t>
+      </w:r>
+      <w:r>
+        <w:rPr>
+          <w:rFonts w:asciiTheme="minorHAnsi" w:hAnsiTheme="minorHAnsi"/>
+        </w:rPr>
+        <w:t>ARTE</w:t>
       </w:r>
       <w:r>
         <w:rPr>
@@ -2060,7 +2227,19 @@
         <w:rPr>
           <w:rFonts w:asciiTheme="minorHAnsi" w:hAnsiTheme="minorHAnsi"/>
         </w:rPr>
-        <w:t>isponibilizar à AMA documento que demonstre</w:t>
+        <w:t xml:space="preserve">isponibilizar à </w:t>
+      </w:r>
+      <w:r>
+        <w:rPr>
+          <w:rFonts w:asciiTheme="minorHAnsi" w:hAnsiTheme="minorHAnsi"/>
+        </w:rPr>
+        <w:t>ARTE</w:t>
+      </w:r>
+      <w:r>
+        <w:rPr>
+          <w:rFonts w:asciiTheme="minorHAnsi" w:hAnsiTheme="minorHAnsi"/>
+        </w:rPr>
+        <w:t xml:space="preserve"> documento que demonstre</w:t>
       </w:r>
       <w:r>
         <w:rPr>
@@ -2143,7 +2322,19 @@
         <w:rPr>
           <w:rFonts w:asciiTheme="minorHAnsi" w:hAnsiTheme="minorHAnsi"/>
         </w:rPr>
-        <w:t xml:space="preserve">isponibilizar à AMA a seguinte informação: </w:t>
+        <w:t xml:space="preserve">isponibilizar à </w:t>
+      </w:r>
+      <w:r>
+        <w:rPr>
+          <w:rFonts w:asciiTheme="minorHAnsi" w:hAnsiTheme="minorHAnsi"/>
+        </w:rPr>
+        <w:t>ARTE</w:t>
+      </w:r>
+      <w:r>
+        <w:rPr>
+          <w:rFonts w:asciiTheme="minorHAnsi" w:hAnsiTheme="minorHAnsi"/>
+        </w:rPr>
+        <w:t xml:space="preserve"> a seguinte informação: </w:t>
       </w:r>
       <w:r>
         <w:rPr>
@@ -2276,7 +2467,19 @@
         <w:rPr>
           <w:rFonts w:asciiTheme="minorHAnsi" w:hAnsiTheme="minorHAnsi"/>
         </w:rPr>
-        <w:t>omunicar à AMA quaisquer novas versões da aplicação de assinatura com CMD e aguardar a sua aprovação para disponibilização ao público</w:t>
+        <w:t xml:space="preserve">omunicar à </w:t>
+      </w:r>
+      <w:r>
+        <w:rPr>
+          <w:rFonts w:asciiTheme="minorHAnsi" w:hAnsiTheme="minorHAnsi"/>
+        </w:rPr>
+        <w:t>ARTE</w:t>
+      </w:r>
+      <w:r>
+        <w:rPr>
+          <w:rFonts w:asciiTheme="minorHAnsi" w:hAnsiTheme="minorHAnsi"/>
+        </w:rPr>
+        <w:t xml:space="preserve"> quaisquer novas versões da aplicação de assinatura com CMD e aguardar a sua aprovação para disponibilização ao público</w:t>
       </w:r>
       <w:r>
         <w:rPr>
@@ -2364,7 +2567,19 @@
         <w:rPr>
           <w:rFonts w:asciiTheme="minorHAnsi" w:hAnsiTheme="minorHAnsi"/>
         </w:rPr>
-        <w:t>2- A AMA tem a faculdade de fiscalizar o funcionamento da aplicação, e dos sistemas envolvidos na sua operação, para verificação do cumprimento das obrigações assumidas no presente Protocolo.</w:t>
+        <w:t xml:space="preserve">2- A </w:t>
+      </w:r>
+      <w:r>
+        <w:rPr>
+          <w:rFonts w:asciiTheme="minorHAnsi" w:hAnsiTheme="minorHAnsi"/>
+        </w:rPr>
+        <w:t>ARTE</w:t>
+      </w:r>
+      <w:r>
+        <w:rPr>
+          <w:rFonts w:asciiTheme="minorHAnsi" w:hAnsiTheme="minorHAnsi"/>
+        </w:rPr>
+        <w:t xml:space="preserve"> tem a faculdade de fiscalizar o funcionamento da aplicação, e dos sistemas envolvidos na sua operação, para verificação do cumprimento das obrigações assumidas no presente Protocolo.</w:t>
       </w:r>
     </w:p>
     <w:p>
@@ -2466,7 +2681,14 @@
         <w:rPr>
           <w:rFonts w:asciiTheme="minorHAnsi" w:hAnsiTheme="minorHAnsi"/>
         </w:rPr>
-        <w:t xml:space="preserve"> Outorgante obriga-se a pagar à Primeira Outorgante os montantes previstos no Anexo I</w:t>
+        <w:t xml:space="preserve"> Outorgante obriga-se a pagar à Primeira </w:t>
+      </w:r>
+      <w:r>
+        <w:rPr>
+          <w:rFonts w:asciiTheme="minorHAnsi" w:hAnsiTheme="minorHAnsi"/>
+        </w:rPr>
+        <w:lastRenderedPageBreak/>
+        <w:t>Outorgante os montantes previstos no Anexo I</w:t>
       </w:r>
       <w:r>
         <w:rPr>
@@ -2575,7 +2797,6 @@
         <w:rPr>
           <w:rFonts w:asciiTheme="minorHAnsi" w:hAnsiTheme="minorHAnsi"/>
         </w:rPr>
-        <w:lastRenderedPageBreak/>
         <w:t xml:space="preserve">3 – </w:t>
       </w:r>
       <w:r>
@@ -2785,7 +3006,18 @@
           <w:rFonts w:asciiTheme="minorHAnsi" w:hAnsiTheme="minorHAnsi" w:cstheme="minorBidi"/>
         </w:rPr>
         <w:tab/>
-        <w:t xml:space="preserve">AMA: E-mail: </w:t>
+      </w:r>
+      <w:r>
+        <w:rPr>
+          <w:rFonts w:asciiTheme="minorHAnsi" w:hAnsiTheme="minorHAnsi" w:cstheme="minorBidi"/>
+        </w:rPr>
+        <w:t>ARTE</w:t>
+      </w:r>
+      <w:r>
+        <w:rPr>
+          <w:rFonts w:asciiTheme="minorHAnsi" w:hAnsiTheme="minorHAnsi" w:cstheme="minorBidi"/>
+        </w:rPr>
+        <w:t xml:space="preserve">: E-mail: </w:t>
       </w:r>
       <w:hyperlink r:id="rId12" w:history="1">
         <w:r>
@@ -2793,7 +3025,21 @@
             <w:rStyle w:val="Hyperlink"/>
             <w:rFonts w:asciiTheme="minorHAnsi" w:hAnsiTheme="minorHAnsi" w:cstheme="minorBidi"/>
           </w:rPr>
-          <w:t>protocolos@ama.gov.pt</w:t>
+          <w:t>protocolos@</w:t>
+        </w:r>
+        <w:r>
+          <w:rPr>
+            <w:rStyle w:val="Hyperlink"/>
+            <w:rFonts w:asciiTheme="minorHAnsi" w:hAnsiTheme="minorHAnsi" w:cstheme="minorBidi"/>
+          </w:rPr>
+          <w:t>ARTE</w:t>
+        </w:r>
+        <w:r>
+          <w:rPr>
+            <w:rStyle w:val="Hyperlink"/>
+            <w:rFonts w:asciiTheme="minorHAnsi" w:hAnsiTheme="minorHAnsi" w:cstheme="minorBidi"/>
+          </w:rPr>
+          <w:t>.gov.pt</w:t>
         </w:r>
       </w:hyperlink>
     </w:p>
@@ -3052,6 +3298,7 @@
         <w:rPr>
           <w:rFonts w:asciiTheme="minorHAnsi" w:hAnsiTheme="minorHAnsi" w:cstheme="minorBidi"/>
         </w:rPr>
+        <w:lastRenderedPageBreak/>
         <w:t>Respeitar a finalidade para que foi autorizada a consulta, que deverá limitar-se ao estritamente necessário, não utilizando a informação para outros fins;</w:t>
       </w:r>
     </w:p>
@@ -3112,7 +3359,6 @@
         <w:rPr>
           <w:rFonts w:asciiTheme="minorHAnsi" w:hAnsiTheme="minorHAnsi" w:cstheme="minorBidi"/>
         </w:rPr>
-        <w:lastRenderedPageBreak/>
         <w:t>Para os efeitos legais e os que decorrerem da execução do presente Protocolo, são identificados pelas Partes os respetivos encarregados de proteção de dados, responsáveis, nomeadamente:</w:t>
       </w:r>
     </w:p>
@@ -3132,7 +3378,19 @@
         <w:rPr>
           <w:rFonts w:asciiTheme="minorHAnsi" w:hAnsiTheme="minorHAnsi" w:cstheme="minorBidi"/>
         </w:rPr>
-        <w:t xml:space="preserve">Pela AMA, </w:t>
+        <w:t xml:space="preserve">Pela </w:t>
+      </w:r>
+      <w:r>
+        <w:rPr>
+          <w:rFonts w:asciiTheme="minorHAnsi" w:hAnsiTheme="minorHAnsi" w:cstheme="minorBidi"/>
+        </w:rPr>
+        <w:t>ARTE</w:t>
+      </w:r>
+      <w:r>
+        <w:rPr>
+          <w:rFonts w:asciiTheme="minorHAnsi" w:hAnsiTheme="minorHAnsi" w:cstheme="minorBidi"/>
+        </w:rPr>
+        <w:t xml:space="preserve">, </w:t>
       </w:r>
       <w:hyperlink r:id="rId13" w:history="1">
         <w:r>
@@ -3140,7 +3398,21 @@
             <w:rStyle w:val="Hyperlink"/>
             <w:rFonts w:asciiTheme="minorHAnsi" w:hAnsiTheme="minorHAnsi" w:cstheme="minorBidi"/>
           </w:rPr>
-          <w:t>dpo@ama.pt</w:t>
+          <w:t>dpo@</w:t>
+        </w:r>
+        <w:r>
+          <w:rPr>
+            <w:rStyle w:val="Hyperlink"/>
+            <w:rFonts w:asciiTheme="minorHAnsi" w:hAnsiTheme="minorHAnsi" w:cstheme="minorBidi"/>
+          </w:rPr>
+          <w:t>ARTE</w:t>
+        </w:r>
+        <w:r>
+          <w:rPr>
+            <w:rStyle w:val="Hyperlink"/>
+            <w:rFonts w:asciiTheme="minorHAnsi" w:hAnsiTheme="minorHAnsi" w:cstheme="minorBidi"/>
+          </w:rPr>
+          <w:t>.pt</w:t>
         </w:r>
       </w:hyperlink>
       <w:r>
@@ -3220,7 +3492,19 @@
         <w:rPr>
           <w:rFonts w:asciiTheme="minorHAnsi" w:hAnsiTheme="minorHAnsi" w:cstheme="minorBidi"/>
         </w:rPr>
-        <w:t xml:space="preserve">Os Outorgantes obrigam-se a garantir o sigilo quanto à informação e elementos de que o seu pessoal ou subcontratados venham a ter conhecimento em virtude do presente Protocolo, devendo ser tratada como estritamente confidencial toda a informação escrita, verbal ou constante de suporte informático que contenha dados de natureza organizativa, técnica, comercial ou financeira, listas de clientes, de fornecedores, de equipamentos ou de produtos ou qualquer outra informação relativa aos serviços e à atividade da AMA e do </w:t>
+        <w:t xml:space="preserve">Os Outorgantes obrigam-se a garantir o sigilo quanto à informação e elementos de que o seu pessoal ou subcontratados venham a ter conhecimento em virtude do presente Protocolo, devendo ser tratada como estritamente confidencial toda a informação escrita, verbal ou constante de suporte informático que contenha dados de natureza organizativa, técnica, comercial ou financeira, listas de clientes, de fornecedores, de equipamentos ou de produtos ou qualquer outra informação relativa aos serviços e à atividade da </w:t>
+      </w:r>
+      <w:r>
+        <w:rPr>
+          <w:rFonts w:asciiTheme="minorHAnsi" w:hAnsiTheme="minorHAnsi" w:cstheme="minorBidi"/>
+        </w:rPr>
+        <w:t>ARTE</w:t>
+      </w:r>
+      <w:r>
+        <w:rPr>
+          <w:rFonts w:asciiTheme="minorHAnsi" w:hAnsiTheme="minorHAnsi" w:cstheme="minorBidi"/>
+        </w:rPr>
+        <w:t xml:space="preserve"> e do </w:t>
       </w:r>
       <w:r>
         <w:rPr>
@@ -3369,6 +3653,7 @@
           <w:rFonts w:asciiTheme="minorHAnsi" w:hAnsiTheme="minorHAnsi"/>
           <w:b/>
         </w:rPr>
+        <w:lastRenderedPageBreak/>
         <w:t xml:space="preserve">Cláusula </w:t>
       </w:r>
       <w:r>
@@ -3560,8 +3845,19 @@
         <w:rPr>
           <w:rFonts w:asciiTheme="minorHAnsi" w:hAnsiTheme="minorHAnsi"/>
         </w:rPr>
-        <w:lastRenderedPageBreak/>
-        <w:t xml:space="preserve">3 - A AMA pode suspender ou cessar </w:t>
+        <w:t xml:space="preserve">3 - A </w:t>
+      </w:r>
+      <w:r>
+        <w:rPr>
+          <w:rFonts w:asciiTheme="minorHAnsi" w:hAnsiTheme="minorHAnsi"/>
+        </w:rPr>
+        <w:t>ARTE</w:t>
+      </w:r>
+      <w:r>
+        <w:rPr>
+          <w:rFonts w:asciiTheme="minorHAnsi" w:hAnsiTheme="minorHAnsi"/>
+        </w:rPr>
+        <w:t xml:space="preserve"> pode suspender ou cessar </w:t>
       </w:r>
       <w:r>
         <w:rPr>
@@ -3840,7 +4136,13 @@
               <w:rPr>
                 <w:rFonts w:asciiTheme="minorHAnsi" w:hAnsiTheme="minorHAnsi"/>
               </w:rPr>
-              <w:t>Pela AMA</w:t>
+              <w:t xml:space="preserve">Pela </w:t>
+            </w:r>
+            <w:r>
+              <w:rPr>
+                <w:rFonts w:asciiTheme="minorHAnsi" w:hAnsiTheme="minorHAnsi"/>
+              </w:rPr>
+              <w:t>ARTE</w:t>
             </w:r>
           </w:p>
         </w:tc>
@@ -5197,14 +5499,13 @@
     <w:r>
       <w:rPr>
         <w:rFonts w:asciiTheme="minorHAnsi" w:hAnsiTheme="minorHAnsi" w:cstheme="minorHAnsi"/>
-        <w:noProof/>
-        <w:lang w:val="en-GB" w:eastAsia="en-GB"/>
+        <w:lang w:eastAsia="pt-PT"/>
       </w:rPr>
       <w:drawing>
-        <wp:inline distT="0" distB="0" distL="0" distR="0" wp14:anchorId="7FF61886" wp14:editId="01CE49BC">
-          <wp:extent cx="2228850" cy="419100"/>
+        <wp:inline distT="0" distB="0" distL="0" distR="0" wp14:anchorId="1091D803" wp14:editId="46189AAB">
+          <wp:extent cx="1126772" cy="704850"/>
           <wp:effectExtent l="0" t="0" r="0" b="0"/>
-          <wp:docPr id="1083400343" name="Imagem 1083400343" descr="A black background with a black square&#10;&#10;AI-generated content may be incorrect."/>
+          <wp:docPr id="1667076744" name="Picture 1" descr="A black and white logo&#10;&#10;AI-generated content may be incorrect."/>
           <wp:cNvGraphicFramePr>
             <a:graphicFrameLocks xmlns:a="http://schemas.openxmlformats.org/drawingml/2006/main" noChangeAspect="1"/>
           </wp:cNvGraphicFramePr>
@@ -5212,39 +5513,23 @@
             <a:graphicData uri="http://schemas.openxmlformats.org/drawingml/2006/picture">
               <pic:pic xmlns:pic="http://schemas.openxmlformats.org/drawingml/2006/picture">
                 <pic:nvPicPr>
-                  <pic:cNvPr id="1083400343" name="Imagem 1083400343" descr="A black background with a black square&#10;&#10;AI-generated content may be incorrect."/>
-                  <pic:cNvPicPr>
-                    <a:picLocks noChangeAspect="1" noChangeArrowheads="1"/>
-                  </pic:cNvPicPr>
+                  <pic:cNvPr id="1667076744" name="Picture 1" descr="A black and white logo&#10;&#10;AI-generated content may be incorrect."/>
+                  <pic:cNvPicPr/>
                 </pic:nvPicPr>
-                <pic:blipFill rotWithShape="1">
-                  <a:blip r:embed="rId1">
-                    <a:extLst>
-                      <a:ext uri="{28A0092B-C50C-407E-A947-70E740481C1C}">
-                        <a14:useLocalDpi xmlns:a14="http://schemas.microsoft.com/office/drawing/2010/main" val="0"/>
-                      </a:ext>
-                    </a:extLst>
-                  </a:blip>
-                  <a:srcRect t="4959" r="63330" b="40496"/>
-                  <a:stretch/>
+                <pic:blipFill>
+                  <a:blip r:embed="rId1"/>
+                  <a:stretch>
+                    <a:fillRect/>
+                  </a:stretch>
                 </pic:blipFill>
-                <pic:spPr bwMode="auto">
+                <pic:spPr>
                   <a:xfrm>
                     <a:off x="0" y="0"/>
-                    <a:ext cx="2228850" cy="419100"/>
+                    <a:ext cx="1196623" cy="748545"/>
                   </a:xfrm>
                   <a:prstGeom prst="rect">
                     <a:avLst/>
                   </a:prstGeom>
-                  <a:noFill/>
-                  <a:ln>
-                    <a:noFill/>
-                  </a:ln>
-                  <a:extLst>
-                    <a:ext uri="{53640926-AAD7-44D8-BBD7-CCE9431645EC}">
-                      <a14:shadowObscured xmlns:a14="http://schemas.microsoft.com/office/drawing/2010/main"/>
-                    </a:ext>
-                  </a:extLst>
                 </pic:spPr>
               </pic:pic>
             </a:graphicData>
@@ -5280,6 +5565,19 @@
       </w:rPr>
       <w:t>Espaço para logotipo do parceiro]</w:t>
     </w:r>
+  </w:p>
+  <w:p>
+    <w:pPr>
+      <w:pStyle w:val="Header"/>
+      <w:tabs>
+        <w:tab w:val="clear" w:pos="8504"/>
+        <w:tab w:val="right" w:pos="9638"/>
+      </w:tabs>
+      <w:ind w:left="-284"/>
+      <w:rPr>
+        <w:rFonts w:asciiTheme="minorHAnsi" w:hAnsiTheme="minorHAnsi" w:cstheme="minorHAnsi"/>
+      </w:rPr>
+    </w:pPr>
   </w:p>
   <w:p>
     <w:pPr>
@@ -5292,121 +5590,7 @@
   </w:p>
   <w:p>
     <w:pPr>
-      <w:spacing w:before="360"/>
       <w:ind w:left="-284"/>
-      <w:rPr>
-        <w:rFonts w:cs="Arial"/>
-        <w:caps/>
-        <w:color w:val="595959" w:themeColor="text1" w:themeTint="A6"/>
-        <w:lang w:eastAsia="pt-PT"/>
-      </w:rPr>
-    </w:pPr>
-    <w:r>
-      <w:rPr>
-        <w:rFonts w:cs="Arial"/>
-        <w:b/>
-        <w:bCs/>
-        <w:caps/>
-        <w:color w:val="595959" w:themeColor="text1" w:themeTint="A6"/>
-        <w:lang w:eastAsia="pt-PT"/>
-      </w:rPr>
-      <w:t>Protocolo</w:t>
-    </w:r>
-    <w:r>
-      <w:rPr>
-        <w:rFonts w:cs="Arial"/>
-        <w:caps/>
-        <w:color w:val="595959" w:themeColor="text1" w:themeTint="A6"/>
-        <w:lang w:eastAsia="pt-PT"/>
-      </w:rPr>
-      <w:t xml:space="preserve"> | </w:t>
-    </w:r>
-    <w:r>
-      <w:rPr>
-        <w:rFonts w:cs="Arial"/>
-        <w:caps/>
-        <w:color w:val="595959" w:themeColor="text1" w:themeTint="A6"/>
-        <w:lang w:eastAsia="pt-PT"/>
-      </w:rPr>
-      <w:t xml:space="preserve">n.º </w:t>
-    </w:r>
-    <w:r>
-      <w:rPr>
-        <w:rFonts w:cs="Arial"/>
-        <w:caps/>
-        <w:color w:val="595959" w:themeColor="text1" w:themeTint="A6"/>
-        <w:lang w:eastAsia="pt-PT"/>
-      </w:rPr>
-      <w:fldChar w:fldCharType="begin"/>
-    </w:r>
-    <w:r>
-      <w:rPr>
-        <w:rFonts w:cs="Arial"/>
-        <w:caps/>
-        <w:color w:val="595959" w:themeColor="text1" w:themeTint="A6"/>
-        <w:lang w:eastAsia="pt-PT"/>
-      </w:rPr>
-      <w:instrText xml:space="preserve"> DOCPROPERTY "FSC#CONFIGLOCALAMA@2305.100:DOC_NumeroProc" \* MERGEFORMAT </w:instrText>
-    </w:r>
-    <w:r>
-      <w:rPr>
-        <w:rFonts w:cs="Arial"/>
-        <w:caps/>
-        <w:color w:val="595959" w:themeColor="text1" w:themeTint="A6"/>
-        <w:lang w:eastAsia="pt-PT"/>
-      </w:rPr>
-      <w:fldChar w:fldCharType="end"/>
-    </w:r>
-    <w:r>
-      <w:rPr>
-        <w:rFonts w:cs="Arial"/>
-        <w:caps/>
-        <w:color w:val="595959" w:themeColor="text1" w:themeTint="A6"/>
-        <w:lang w:eastAsia="pt-PT"/>
-      </w:rPr>
-      <w:t>/</w:t>
-    </w:r>
-    <w:r>
-      <w:rPr>
-        <w:rFonts w:cs="Arial"/>
-        <w:caps/>
-        <w:color w:val="595959" w:themeColor="text1" w:themeTint="A6"/>
-        <w:lang w:eastAsia="pt-PT"/>
-      </w:rPr>
-      <w:fldChar w:fldCharType="begin"/>
-    </w:r>
-    <w:r>
-      <w:rPr>
-        <w:rFonts w:cs="Arial"/>
-        <w:caps/>
-        <w:color w:val="595959" w:themeColor="text1" w:themeTint="A6"/>
-        <w:lang w:eastAsia="pt-PT"/>
-      </w:rPr>
-      <w:instrText xml:space="preserve"> DOCPROPERTY "FSC#CONFIGLOCALAMA@2305.100:DOC_AnoProcesso" \* MERGEFORMAT </w:instrText>
-    </w:r>
-    <w:r>
-      <w:rPr>
-        <w:rFonts w:cs="Arial"/>
-        <w:caps/>
-        <w:color w:val="595959" w:themeColor="text1" w:themeTint="A6"/>
-        <w:lang w:eastAsia="pt-PT"/>
-      </w:rPr>
-      <w:fldChar w:fldCharType="end"/>
-    </w:r>
-    <w:r>
-      <w:rPr>
-        <w:rFonts w:cs="Arial"/>
-        <w:caps/>
-        <w:color w:val="595959" w:themeColor="text1" w:themeTint="A6"/>
-        <w:lang w:eastAsia="pt-PT"/>
-      </w:rPr>
-      <w:t xml:space="preserve">-AMA </w:t>
-    </w:r>
-  </w:p>
-  <w:p>
-    <w:pPr>
-      <w:ind w:left="-284"/>
-      <w:jc w:val="both"/>
       <w:rPr>
         <w:rFonts w:asciiTheme="minorHAnsi" w:hAnsiTheme="minorHAnsi" w:cs="Arial"/>
         <w:b/>
@@ -5419,9 +5603,144 @@
     <w:r>
       <w:rPr>
         <w:rFonts w:asciiTheme="minorHAnsi" w:hAnsiTheme="minorHAnsi" w:cs="Arial"/>
+        <w:b/>
+        <w:bCs/>
         <w:caps/>
-        <w:noProof/>
-        <w:color w:val="000000" w:themeColor="text1"/>
+        <w:color w:val="595959" w:themeColor="text1" w:themeTint="A6"/>
+        <w:lang w:eastAsia="pt-PT"/>
+      </w:rPr>
+      <w:t xml:space="preserve">Protocolo | n.º </w:t>
+    </w:r>
+    <w:r>
+      <w:rPr>
+        <w:rFonts w:asciiTheme="minorHAnsi" w:hAnsiTheme="minorHAnsi" w:cs="Arial"/>
+        <w:b/>
+        <w:bCs/>
+        <w:caps/>
+        <w:color w:val="595959" w:themeColor="text1" w:themeTint="A6"/>
+        <w:lang w:eastAsia="pt-PT"/>
+      </w:rPr>
+      <w:fldChar w:fldCharType="begin"/>
+    </w:r>
+    <w:r>
+      <w:rPr>
+        <w:rFonts w:asciiTheme="minorHAnsi" w:hAnsiTheme="minorHAnsi" w:cs="Arial"/>
+        <w:b/>
+        <w:bCs/>
+        <w:caps/>
+        <w:color w:val="595959" w:themeColor="text1" w:themeTint="A6"/>
+        <w:lang w:eastAsia="pt-PT"/>
+      </w:rPr>
+      <w:instrText xml:space="preserve"> DOCPROPERTY "FSC#CONFIGLOCALAMA@2305.100:DOC_NumeroProc" \* MERGEFORMAT </w:instrText>
+    </w:r>
+    <w:r>
+      <w:rPr>
+        <w:rFonts w:asciiTheme="minorHAnsi" w:hAnsiTheme="minorHAnsi" w:cs="Arial"/>
+        <w:b/>
+        <w:bCs/>
+        <w:caps/>
+        <w:color w:val="595959" w:themeColor="text1" w:themeTint="A6"/>
+        <w:lang w:eastAsia="pt-PT"/>
+      </w:rPr>
+      <w:fldChar w:fldCharType="end"/>
+    </w:r>
+    <w:r>
+      <w:rPr>
+        <w:rFonts w:asciiTheme="minorHAnsi" w:hAnsiTheme="minorHAnsi" w:cs="Arial"/>
+        <w:b/>
+        <w:bCs/>
+        <w:caps/>
+        <w:color w:val="595959" w:themeColor="text1" w:themeTint="A6"/>
+        <w:lang w:eastAsia="pt-PT"/>
+      </w:rPr>
+      <w:t>/</w:t>
+    </w:r>
+    <w:r>
+      <w:rPr>
+        <w:rFonts w:asciiTheme="minorHAnsi" w:hAnsiTheme="minorHAnsi" w:cs="Arial"/>
+        <w:b/>
+        <w:bCs/>
+        <w:caps/>
+        <w:color w:val="595959" w:themeColor="text1" w:themeTint="A6"/>
+        <w:lang w:eastAsia="pt-PT"/>
+      </w:rPr>
+      <w:fldChar w:fldCharType="begin"/>
+    </w:r>
+    <w:r>
+      <w:rPr>
+        <w:rFonts w:asciiTheme="minorHAnsi" w:hAnsiTheme="minorHAnsi" w:cs="Arial"/>
+        <w:b/>
+        <w:bCs/>
+        <w:caps/>
+        <w:color w:val="595959" w:themeColor="text1" w:themeTint="A6"/>
+        <w:lang w:eastAsia="pt-PT"/>
+      </w:rPr>
+      <w:instrText xml:space="preserve"> DOCPROPERTY "FSC#CONFIGLOCALAMA@2305.100:DOC_AnoProcesso" \* MERGEFORMAT </w:instrText>
+    </w:r>
+    <w:r>
+      <w:rPr>
+        <w:rFonts w:asciiTheme="minorHAnsi" w:hAnsiTheme="minorHAnsi" w:cs="Arial"/>
+        <w:b/>
+        <w:bCs/>
+        <w:caps/>
+        <w:color w:val="595959" w:themeColor="text1" w:themeTint="A6"/>
+        <w:lang w:eastAsia="pt-PT"/>
+      </w:rPr>
+      <w:fldChar w:fldCharType="end"/>
+    </w:r>
+    <w:r>
+      <w:rPr>
+        <w:rFonts w:asciiTheme="minorHAnsi" w:hAnsiTheme="minorHAnsi" w:cs="Arial"/>
+        <w:b/>
+        <w:bCs/>
+        <w:caps/>
+        <w:color w:val="595959" w:themeColor="text1" w:themeTint="A6"/>
+        <w:lang w:eastAsia="pt-PT"/>
+      </w:rPr>
+      <w:t>-</w:t>
+    </w:r>
+    <w:r>
+      <w:rPr>
+        <w:rFonts w:asciiTheme="minorHAnsi" w:hAnsiTheme="minorHAnsi" w:cs="Arial"/>
+        <w:b/>
+        <w:bCs/>
+        <w:caps/>
+        <w:color w:val="595959" w:themeColor="text1" w:themeTint="A6"/>
+        <w:lang w:eastAsia="pt-PT"/>
+      </w:rPr>
+      <w:t>ARTE</w:t>
+    </w:r>
+    <w:r>
+      <w:rPr>
+        <w:rFonts w:asciiTheme="minorHAnsi" w:hAnsiTheme="minorHAnsi" w:cs="Arial"/>
+        <w:b/>
+        <w:bCs/>
+        <w:caps/>
+        <w:color w:val="595959" w:themeColor="text1" w:themeTint="A6"/>
+        <w:lang w:eastAsia="pt-PT"/>
+      </w:rPr>
+      <w:t xml:space="preserve"> </w:t>
+    </w:r>
+  </w:p>
+  <w:p>
+    <w:pPr>
+      <w:ind w:left="-284"/>
+      <w:rPr>
+        <w:rFonts w:asciiTheme="minorHAnsi" w:hAnsiTheme="minorHAnsi" w:cs="Arial"/>
+        <w:b/>
+        <w:bCs/>
+        <w:caps/>
+        <w:color w:val="595959" w:themeColor="text1" w:themeTint="A6"/>
+        <w:lang w:eastAsia="pt-PT"/>
+      </w:rPr>
+    </w:pPr>
+    <w:r>
+      <w:rPr>
+        <w:rFonts w:asciiTheme="minorHAnsi" w:hAnsiTheme="minorHAnsi" w:cs="Arial"/>
+        <w:b/>
+        <w:bCs/>
+        <w:caps/>
+        <w:color w:val="595959" w:themeColor="text1" w:themeTint="A6"/>
         <w:lang w:eastAsia="pt-PT"/>
       </w:rPr>
       <mc:AlternateContent>
@@ -5514,7 +5833,7 @@
         <w:color w:val="595959" w:themeColor="text1" w:themeTint="A6"/>
         <w:lang w:eastAsia="pt-PT"/>
       </w:rPr>
-      <w:t>Protocolo entre a Agência para a Mode</w:t>
+      <w:t xml:space="preserve">Protocolo entre a </w:t>
     </w:r>
     <w:r>
       <w:rPr>
@@ -5525,7 +5844,7 @@
         <w:color w:val="595959" w:themeColor="text1" w:themeTint="A6"/>
         <w:lang w:eastAsia="pt-PT"/>
       </w:rPr>
-      <w:t>rnização Administrativa, I.p. E O […]</w:t>
+      <w:t>Agência para a reforma tecnológica do estado</w:t>
     </w:r>
     <w:r>
       <w:rPr>
@@ -5536,7 +5855,7 @@
         <w:color w:val="595959" w:themeColor="text1" w:themeTint="A6"/>
         <w:lang w:eastAsia="pt-PT"/>
       </w:rPr>
-      <w:t xml:space="preserve"> </w:t>
+      <w:t>, I.p. E O […]</w:t>
     </w:r>
     <w:r>
       <w:rPr>
@@ -5547,7 +5866,7 @@
         <w:color w:val="595959" w:themeColor="text1" w:themeTint="A6"/>
         <w:lang w:eastAsia="pt-PT"/>
       </w:rPr>
-      <w:t>para disponibilização de autenticação</w:t>
+      <w:t xml:space="preserve"> </w:t>
     </w:r>
     <w:r>
       <w:rPr>
@@ -5558,7 +5877,7 @@
         <w:color w:val="595959" w:themeColor="text1" w:themeTint="A6"/>
         <w:lang w:eastAsia="pt-PT"/>
       </w:rPr>
-      <w:t xml:space="preserve"> e Assinatura</w:t>
+      <w:t>para disponibilização de autenticação</w:t>
     </w:r>
     <w:r>
       <w:rPr>
@@ -5569,6 +5888,17 @@
         <w:color w:val="595959" w:themeColor="text1" w:themeTint="A6"/>
         <w:lang w:eastAsia="pt-PT"/>
       </w:rPr>
+      <w:t xml:space="preserve"> e Assinatura</w:t>
+    </w:r>
+    <w:r>
+      <w:rPr>
+        <w:rFonts w:asciiTheme="minorHAnsi" w:hAnsiTheme="minorHAnsi" w:cs="Arial"/>
+        <w:b/>
+        <w:bCs/>
+        <w:caps/>
+        <w:color w:val="595959" w:themeColor="text1" w:themeTint="A6"/>
+        <w:lang w:eastAsia="pt-PT"/>
+      </w:rPr>
       <w:t xml:space="preserve"> através de chave móvel digital </w:t>
     </w:r>
   </w:p>
@@ -5576,7 +5906,9 @@
     <w:pPr>
       <w:ind w:left="-284"/>
       <w:rPr>
-        <w:rFonts w:ascii="Arial" w:hAnsi="Arial" w:cs="Arial"/>
+        <w:rFonts w:asciiTheme="minorHAnsi" w:hAnsiTheme="minorHAnsi" w:cs="Arial"/>
+        <w:b/>
+        <w:bCs/>
         <w:caps/>
         <w:color w:val="595959" w:themeColor="text1" w:themeTint="A6"/>
         <w:lang w:eastAsia="pt-PT"/>
@@ -5584,7 +5916,9 @@
     </w:pPr>
     <w:r>
       <w:rPr>
-        <w:rFonts w:ascii="Arial" w:hAnsi="Arial" w:cs="Arial"/>
+        <w:rFonts w:asciiTheme="minorHAnsi" w:hAnsiTheme="minorHAnsi" w:cs="Arial"/>
+        <w:b/>
+        <w:bCs/>
         <w:caps/>
         <w:color w:val="595959" w:themeColor="text1" w:themeTint="A6"/>
         <w:lang w:eastAsia="pt-PT"/>
@@ -5674,7 +6008,25 @@
         <w:color w:val="595959" w:themeColor="text1" w:themeTint="A6"/>
         <w:lang w:eastAsia="pt-PT"/>
       </w:rPr>
-      <w:t xml:space="preserve">/20-AMA </w:t>
+      <w:t>/20-</w:t>
+    </w:r>
+    <w:r>
+      <w:rPr>
+        <w:rFonts w:asciiTheme="minorHAnsi" w:hAnsiTheme="minorHAnsi" w:cs="Arial"/>
+        <w:caps/>
+        <w:color w:val="595959" w:themeColor="text1" w:themeTint="A6"/>
+        <w:lang w:eastAsia="pt-PT"/>
+      </w:rPr>
+      <w:t>ARTE</w:t>
+    </w:r>
+    <w:r>
+      <w:rPr>
+        <w:rFonts w:asciiTheme="minorHAnsi" w:hAnsiTheme="minorHAnsi" w:cs="Arial"/>
+        <w:caps/>
+        <w:color w:val="595959" w:themeColor="text1" w:themeTint="A6"/>
+        <w:lang w:eastAsia="pt-PT"/>
+      </w:rPr>
+      <w:t xml:space="preserve"> </w:t>
     </w:r>
   </w:p>
   <w:p>
@@ -8147,7 +8499,7 @@
   <w:num w:numId="23" w16cid:durableId="1380006835">
     <w:abstractNumId w:val="18"/>
     <w:lvlOverride w:ilvl="0">
-      <w:lvl w:ilvl="0" w:tplc="241C8DD4">
+      <w:lvl w:ilvl="0" w:tplc="53C0584C">
         <w:start w:val="1"/>
         <w:numFmt w:val="decimal"/>
         <w:lvlText w:val="%1."/>
@@ -9191,6 +9543,16 @@
 </file>
 
 <file path=customXml/item1.xml><?xml version="1.0" encoding="utf-8"?>
+<p:properties xmlns:p="http://schemas.microsoft.com/office/2006/metadata/properties" xmlns:xsi="http://www.w3.org/2001/XMLSchema-instance" xmlns:pc="http://schemas.microsoft.com/office/infopath/2007/PartnerControls">
+  <documentManagement/>
+</p:properties>
+</file>
+
+<file path=customXml/item2.xml><?xml version="1.0" encoding="utf-8"?>
+<b:Sources xmlns:b="http://schemas.openxmlformats.org/officeDocument/2006/bibliography" xmlns="http://schemas.openxmlformats.org/officeDocument/2006/bibliography" SelectedStyle="\APA.XSL" StyleName="APA"/>
+</file>
+
+<file path=customXml/item3.xml><?xml version="1.0" encoding="utf-8"?>
 <?mso-contentType ?>
 <FormTemplates xmlns="http://schemas.microsoft.com/sharepoint/v3/contenttype/forms">
   <Display>DocumentLibraryForm</Display>
@@ -9199,49 +9561,7 @@
 </FormTemplates>
 </file>
 
-<file path=customXml/item2.xml><?xml version="1.0" encoding="utf-8"?>
-<b:Sources xmlns:b="http://schemas.openxmlformats.org/officeDocument/2006/bibliography" xmlns="http://schemas.openxmlformats.org/officeDocument/2006/bibliography" SelectedStyle="\APA.XSL" StyleName="APA"/>
-</file>
-
-<file path=customXml/item3.xml><?xml version="1.0" encoding="utf-8"?>
-<p:properties xmlns:p="http://schemas.microsoft.com/office/2006/metadata/properties" xmlns:xsi="http://www.w3.org/2001/XMLSchema-instance" xmlns:pc="http://schemas.microsoft.com/office/infopath/2007/PartnerControls">
-  <documentManagement/>
-</p:properties>
-</file>
-
 <file path=customXml/item4.xml><?xml version="1.0" encoding="utf-8"?>
-<f:fields xmlns:f="http://schemas.fabasoft.com/folio/2007/fields">
-  <f:record>
-    <f:field ref="objname" par="" text="AMA_Protocolo_CMD_Autenticação_Assinatura_Privados" edit="true"/>
-    <f:field ref="objsubject" par="" text="" edit="true"/>
-    <f:field ref="objcreatedby" par="" text="Joana Pires"/>
-    <f:field ref="objcreatedat" par="" date="2022-01-19T16:09:07" text="19/01/2022 16:09:07"/>
-    <f:field ref="objchangedby" par="" text="Joana Pires"/>
-    <f:field ref="objmodifiedat" par="" date="2022-01-19T16:09:07" text="19/01/2022 16:09:07"/>
-    <f:field ref="doc_FSCFOLIO_1_1001_FieldDocumentNumber" par="" text=""/>
-    <f:field ref="doc_FSCFOLIO_1_1001_FieldSubject" par="" text="" edit="true"/>
-    <f:field ref="FSCFOLIO_1_1001_FieldCurrentUser" par="" text="Joana Pires"/>
-    <f:field ref="CCAPRECONFIG_15_1001_Objektname" par="" text="AMA_Protocolo_CMD_Autenticação_Assinatura_Privados" edit="true"/>
-    <f:field ref="CCAPRECONFIG_15_1001_Objektname" par="" text="AMA_Protocolo_CMD_Autenticação_Assinatura_Privados" edit="true"/>
-  </f:record>
-  <f:display par="" text="General">
-    <f:field ref="objname" text="Nome"/>
-    <f:field ref="objsubject" text="Assunto"/>
-    <f:field ref="objcreatedby" text="Criado por"/>
-    <f:field ref="objcreatedat" text="Criado em/às"/>
-    <f:field ref="objchangedby" text="Última alteração por"/>
-    <f:field ref="objmodifiedat" text="Última alteração em/às"/>
-    <f:field ref="FSCFOLIO_1_1001_FieldCurrentUser" text="Utilizador actual"/>
-    <f:field ref="CCAPRECONFIG_15_1001_Objektname" text="Objektname"/>
-  </f:display>
-  <f:display par="" text="Carta em série">
-    <f:field ref="doc_FSCFOLIO_1_1001_FieldDocumentNumber" text="Número do documento"/>
-    <f:field ref="doc_FSCFOLIO_1_1001_FieldSubject" text="Assunto"/>
-  </f:display>
-</f:fields>
-</file>
-
-<file path=customXml/item5.xml><?xml version="1.0" encoding="utf-8"?>
 <ct:contentTypeSchema xmlns:ct="http://schemas.microsoft.com/office/2006/metadata/contentType" xmlns:ma="http://schemas.microsoft.com/office/2006/metadata/properties/metaAttributes" ct:_="" ma:_="" ma:contentTypeName="Documento" ma:contentTypeID="0x0101005B33CE0989C7C04FAC1059BFCF2AA9C9" ma:contentTypeVersion="12" ma:contentTypeDescription="Criar um novo documento." ma:contentTypeScope="" ma:versionID="64f3ecc5ecdce8036863e73af23c9e95">
   <xsd:schema xmlns:xsd="http://www.w3.org/2001/XMLSchema" xmlns:xs="http://www.w3.org/2001/XMLSchema" xmlns:p="http://schemas.microsoft.com/office/2006/metadata/properties" xmlns:ns2="29131337-9f48-4dd8-8094-a140ac1e3b23" xmlns:ns3="ee0d3de4-1e47-4168-94db-bd82c32bb80b" targetNamespace="http://schemas.microsoft.com/office/2006/metadata/properties" ma:root="true" ma:fieldsID="cd8d3b229c0ebe245858252c2b788675" ns2:_="" ns3:_="">
     <xsd:import namespace="29131337-9f48-4dd8-8094-a140ac1e3b23"/>
@@ -9458,10 +9778,43 @@
 </ct:contentTypeSchema>
 </file>
 
+<file path=customXml/item5.xml><?xml version="1.0" encoding="utf-8"?>
+<f:fields xmlns:f="http://schemas.fabasoft.com/folio/2007/fields">
+  <f:record>
+    <f:field ref="objname" par="" text="AMA_Protocolo_CMD_Autenticação_Assinatura_Privados" edit="true"/>
+    <f:field ref="objsubject" par="" text="" edit="true"/>
+    <f:field ref="objcreatedby" par="" text="Joana Pires"/>
+    <f:field ref="objcreatedat" par="" date="2022-01-19T16:09:07" text="19/01/2022 16:09:07"/>
+    <f:field ref="objchangedby" par="" text="Joana Pires"/>
+    <f:field ref="objmodifiedat" par="" date="2022-01-19T16:09:07" text="19/01/2022 16:09:07"/>
+    <f:field ref="doc_FSCFOLIO_1_1001_FieldDocumentNumber" par="" text=""/>
+    <f:field ref="doc_FSCFOLIO_1_1001_FieldSubject" par="" text="" edit="true"/>
+    <f:field ref="FSCFOLIO_1_1001_FieldCurrentUser" par="" text="Joana Pires"/>
+    <f:field ref="CCAPRECONFIG_15_1001_Objektname" par="" text="AMA_Protocolo_CMD_Autenticação_Assinatura_Privados" edit="true"/>
+    <f:field ref="CCAPRECONFIG_15_1001_Objektname" par="" text="AMA_Protocolo_CMD_Autenticação_Assinatura_Privados" edit="true"/>
+  </f:record>
+  <f:display par="" text="General">
+    <f:field ref="objname" text="Nome"/>
+    <f:field ref="objsubject" text="Assunto"/>
+    <f:field ref="objcreatedby" text="Criado por"/>
+    <f:field ref="objcreatedat" text="Criado em/às"/>
+    <f:field ref="objchangedby" text="Última alteração por"/>
+    <f:field ref="objmodifiedat" text="Última alteração em/às"/>
+    <f:field ref="FSCFOLIO_1_1001_FieldCurrentUser" text="Utilizador actual"/>
+    <f:field ref="CCAPRECONFIG_15_1001_Objektname" text="Objektname"/>
+  </f:display>
+  <f:display par="" text="Carta em série">
+    <f:field ref="doc_FSCFOLIO_1_1001_FieldDocumentNumber" text="Número do documento"/>
+    <f:field ref="doc_FSCFOLIO_1_1001_FieldSubject" text="Assunto"/>
+  </f:display>
+</f:fields>
+</file>
+
 <file path=customXml/itemProps1.xml><?xml version="1.0" encoding="utf-8"?>
-<ds:datastoreItem xmlns:ds="http://schemas.openxmlformats.org/officeDocument/2006/customXml" ds:itemID="{C014179D-6901-4F5C-B083-7DF14112A13F}">
+<ds:datastoreItem xmlns:ds="http://schemas.openxmlformats.org/officeDocument/2006/customXml" ds:itemID="{46B33C52-174D-4099-B158-9F4BD6EE461F}">
   <ds:schemaRefs>
-    <ds:schemaRef ds:uri="http://schemas.microsoft.com/sharepoint/v3/contenttype/forms"/>
+    <ds:schemaRef ds:uri="http://schemas.microsoft.com/office/2006/metadata/properties"/>
+    <ds:schemaRef ds:uri="http://schemas.microsoft.com/office/infopath/2007/PartnerControls"/>
   </ds:schemaRefs>
 </ds:datastoreItem>
 </file>
@@ -9475,23 +9828,14 @@
 </file>
 
 <file path=customXml/itemProps3.xml><?xml version="1.0" encoding="utf-8"?>
-<ds:datastoreItem xmlns:ds="http://schemas.openxmlformats.org/officeDocument/2006/customXml" ds:itemID="{46B33C52-174D-4099-B158-9F4BD6EE461F}">
+<ds:datastoreItem xmlns:ds="http://schemas.openxmlformats.org/officeDocument/2006/customXml" ds:itemID="{C014179D-6901-4F5C-B083-7DF14112A13F}">
   <ds:schemaRefs>
-    <ds:schemaRef ds:uri="http://schemas.microsoft.com/office/2006/metadata/properties"/>
-    <ds:schemaRef ds:uri="http://schemas.microsoft.com/office/infopath/2007/PartnerControls"/>
+    <ds:schemaRef ds:uri="http://schemas.microsoft.com/sharepoint/v3/contenttype/forms"/>
   </ds:schemaRefs>
 </ds:datastoreItem>
 </file>
 
 <file path=customXml/itemProps4.xml><?xml version="1.0" encoding="utf-8"?>
-<ds:datastoreItem xmlns:ds="http://schemas.openxmlformats.org/officeDocument/2006/customXml" ds:itemID="{4E8A9591-F074-446B-902F-511FF79C122F}">
-  <ds:schemaRefs>
-    <ds:schemaRef ds:uri="http://schemas.fabasoft.com/folio/2007/fields"/>
-  </ds:schemaRefs>
-</ds:datastoreItem>
-</file>
-
-<file path=customXml/itemProps5.xml><?xml version="1.0" encoding="utf-8"?>
 <ds:datastoreItem xmlns:ds="http://schemas.openxmlformats.org/officeDocument/2006/customXml" ds:itemID="{5BB9B586-B53C-4BC6-B9DC-467783CAEB83}">
   <ds:schemaRefs>
     <ds:schemaRef ds:uri="http://schemas.microsoft.com/office/2006/metadata/contentType"/>
@@ -9508,4 +9852,12 @@
     <ds:schemaRef ds:uri="http://schemas.microsoft.com/internal/obd"/>
   </ds:schemaRefs>
 </ds:datastoreItem>
+</file>
+
+<file path=customXml/itemProps5.xml><?xml version="1.0" encoding="utf-8"?>
+<ds:datastoreItem xmlns:ds="http://schemas.openxmlformats.org/officeDocument/2006/customXml" ds:itemID="{4E8A9591-F074-446B-902F-511FF79C122F}">
+  <ds:schemaRefs>
+    <ds:schemaRef ds:uri="http://schemas.fabasoft.com/folio/2007/fields"/>
+  </ds:schemaRefs>
+</ds:datastoreItem>
 </file>
</xml_diff>